<commit_message>
Corrección Scripts y plantilla
</commit_message>
<xml_diff>
--- a/2º Entrega/TFM (segunda entrega).docx
+++ b/2º Entrega/TFM (segunda entrega).docx
@@ -23,7 +23,7 @@
           <w:lang w:eastAsia="es-ES"/>
         </w:rPr>
         <w:drawing>
-          <wp:inline distT="0" distB="0" distL="0" distR="0" wp14:anchorId="402EFF8F" wp14:editId="6244FD4F">
+          <wp:inline distT="0" distB="0" distL="0" distR="0" wp14:anchorId="402EFF8F" wp14:editId="6ECEEB58">
             <wp:extent cx="3815723" cy="1038225"/>
             <wp:effectExtent l="0" t="0" r="0" b="0"/>
             <wp:docPr id="5126" name="Picture 1"/>
@@ -681,17 +681,14 @@
       <w:pPr>
         <w:pStyle w:val="Ttulondices"/>
       </w:pPr>
-      <w:proofErr w:type="spellStart"/>
       <w:r>
         <w:lastRenderedPageBreak/>
         <w:t>Abstract</w:t>
       </w:r>
-      <w:proofErr w:type="spellEnd"/>
     </w:p>
     <w:p/>
     <w:p/>
     <w:p>
-      <w:proofErr w:type="spellStart"/>
       <w:r>
         <w:rPr>
           <w:b/>
@@ -699,7 +696,6 @@
         </w:rPr>
         <w:t>Keywords</w:t>
       </w:r>
-      <w:proofErr w:type="spellEnd"/>
       <w:r>
         <w:t xml:space="preserve">: </w:t>
       </w:r>
@@ -752,7 +748,7 @@
         </w:rPr>
         <w:fldChar w:fldCharType="separate"/>
       </w:r>
-      <w:hyperlink w:anchor="_Toc226279068" w:history="1">
+      <w:hyperlink w:anchor="_Toc228992840" w:history="1">
         <w:r>
           <w:rPr>
             <w:rStyle w:val="Hipervnculo"/>
@@ -795,7 +791,7 @@
             <w:noProof/>
             <w:webHidden/>
           </w:rPr>
-          <w:instrText xml:space="preserve"> PAGEREF _Toc226279068 \h </w:instrText>
+          <w:instrText xml:space="preserve"> PAGEREF _Toc228992840 \h </w:instrText>
         </w:r>
         <w:r>
           <w:rPr>
@@ -840,7 +836,7 @@
           <w14:ligatures w14:val="standardContextual"/>
         </w:rPr>
       </w:pPr>
-      <w:hyperlink w:anchor="_Toc226279069" w:history="1">
+      <w:hyperlink w:anchor="_Toc228992841" w:history="1">
         <w:r>
           <w:rPr>
             <w:rStyle w:val="Hipervnculo"/>
@@ -883,7 +879,7 @@
             <w:noProof/>
             <w:webHidden/>
           </w:rPr>
-          <w:instrText xml:space="preserve"> PAGEREF _Toc226279069 \h </w:instrText>
+          <w:instrText xml:space="preserve"> PAGEREF _Toc228992841 \h </w:instrText>
         </w:r>
         <w:r>
           <w:rPr>
@@ -928,7 +924,7 @@
           <w14:ligatures w14:val="standardContextual"/>
         </w:rPr>
       </w:pPr>
-      <w:hyperlink w:anchor="_Toc226279070" w:history="1">
+      <w:hyperlink w:anchor="_Toc228992842" w:history="1">
         <w:r>
           <w:rPr>
             <w:rStyle w:val="Hipervnculo"/>
@@ -971,7 +967,7 @@
             <w:noProof/>
             <w:webHidden/>
           </w:rPr>
-          <w:instrText xml:space="preserve"> PAGEREF _Toc226279070 \h </w:instrText>
+          <w:instrText xml:space="preserve"> PAGEREF _Toc228992842 \h </w:instrText>
         </w:r>
         <w:r>
           <w:rPr>
@@ -1016,7 +1012,7 @@
           <w14:ligatures w14:val="standardContextual"/>
         </w:rPr>
       </w:pPr>
-      <w:hyperlink w:anchor="_Toc226279071" w:history="1">
+      <w:hyperlink w:anchor="_Toc228992843" w:history="1">
         <w:r>
           <w:rPr>
             <w:rStyle w:val="Hipervnculo"/>
@@ -1059,7 +1055,7 @@
             <w:noProof/>
             <w:webHidden/>
           </w:rPr>
-          <w:instrText xml:space="preserve"> PAGEREF _Toc226279071 \h </w:instrText>
+          <w:instrText xml:space="preserve"> PAGEREF _Toc228992843 \h </w:instrText>
         </w:r>
         <w:r>
           <w:rPr>
@@ -1104,7 +1100,7 @@
           <w14:ligatures w14:val="standardContextual"/>
         </w:rPr>
       </w:pPr>
-      <w:hyperlink w:anchor="_Toc226279072" w:history="1">
+      <w:hyperlink w:anchor="_Toc228992844" w:history="1">
         <w:r>
           <w:rPr>
             <w:rStyle w:val="Hipervnculo"/>
@@ -1147,7 +1143,7 @@
             <w:noProof/>
             <w:webHidden/>
           </w:rPr>
-          <w:instrText xml:space="preserve"> PAGEREF _Toc226279072 \h </w:instrText>
+          <w:instrText xml:space="preserve"> PAGEREF _Toc228992844 \h </w:instrText>
         </w:r>
         <w:r>
           <w:rPr>
@@ -1192,7 +1188,7 @@
           <w14:ligatures w14:val="standardContextual"/>
         </w:rPr>
       </w:pPr>
-      <w:hyperlink w:anchor="_Toc226279073" w:history="1">
+      <w:hyperlink w:anchor="_Toc228992845" w:history="1">
         <w:r>
           <w:rPr>
             <w:rStyle w:val="Hipervnculo"/>
@@ -1235,7 +1231,7 @@
             <w:noProof/>
             <w:webHidden/>
           </w:rPr>
-          <w:instrText xml:space="preserve"> PAGEREF _Toc226279073 \h </w:instrText>
+          <w:instrText xml:space="preserve"> PAGEREF _Toc228992845 \h </w:instrText>
         </w:r>
         <w:r>
           <w:rPr>
@@ -1280,7 +1276,7 @@
           <w14:ligatures w14:val="standardContextual"/>
         </w:rPr>
       </w:pPr>
-      <w:hyperlink w:anchor="_Toc226279074" w:history="1">
+      <w:hyperlink w:anchor="_Toc228992846" w:history="1">
         <w:r>
           <w:rPr>
             <w:rStyle w:val="Hipervnculo"/>
@@ -1302,7 +1298,7 @@
             <w:rStyle w:val="Hipervnculo"/>
             <w:noProof/>
           </w:rPr>
-          <w:t>Fuentes de Datos</w:t>
+          <w:t>Obtención de los Datos y Criterios de Selección</w:t>
         </w:r>
         <w:r>
           <w:rPr>
@@ -1323,7 +1319,7 @@
             <w:noProof/>
             <w:webHidden/>
           </w:rPr>
-          <w:instrText xml:space="preserve"> PAGEREF _Toc226279074 \h </w:instrText>
+          <w:instrText xml:space="preserve"> PAGEREF _Toc228992846 \h </w:instrText>
         </w:r>
         <w:r>
           <w:rPr>
@@ -1368,7 +1364,7 @@
           <w14:ligatures w14:val="standardContextual"/>
         </w:rPr>
       </w:pPr>
-      <w:hyperlink w:anchor="_Toc226279075" w:history="1">
+      <w:hyperlink w:anchor="_Toc228992847" w:history="1">
         <w:r>
           <w:rPr>
             <w:rStyle w:val="Hipervnculo"/>
@@ -1390,7 +1386,7 @@
             <w:rStyle w:val="Hipervnculo"/>
             <w:noProof/>
           </w:rPr>
-          <w:t>“Título 3” del menú de estilos</w:t>
+          <w:t>Fuente de datos</w:t>
         </w:r>
         <w:r>
           <w:rPr>
@@ -1411,7 +1407,7 @@
             <w:noProof/>
             <w:webHidden/>
           </w:rPr>
-          <w:instrText xml:space="preserve"> PAGEREF _Toc226279075 \h </w:instrText>
+          <w:instrText xml:space="preserve"> PAGEREF _Toc228992847 \h </w:instrText>
         </w:r>
         <w:r>
           <w:rPr>
@@ -1432,6 +1428,94 @@
             <w:webHidden/>
           </w:rPr>
           <w:t>10</w:t>
+        </w:r>
+        <w:r>
+          <w:rPr>
+            <w:noProof/>
+            <w:webHidden/>
+          </w:rPr>
+          <w:fldChar w:fldCharType="end"/>
+        </w:r>
+      </w:hyperlink>
+    </w:p>
+    <w:p>
+      <w:pPr>
+        <w:pStyle w:val="TDC3"/>
+        <w:tabs>
+          <w:tab w:val="left" w:pos="1440"/>
+          <w:tab w:val="right" w:leader="dot" w:pos="9061"/>
+        </w:tabs>
+        <w:rPr>
+          <w:rFonts w:eastAsiaTheme="minorEastAsia" w:cstheme="minorBidi"/>
+          <w:noProof/>
+          <w:kern w:val="2"/>
+          <w14:ligatures w14:val="standardContextual"/>
+        </w:rPr>
+      </w:pPr>
+      <w:hyperlink w:anchor="_Toc228992848" w:history="1">
+        <w:r>
+          <w:rPr>
+            <w:rStyle w:val="Hipervnculo"/>
+            <w:noProof/>
+          </w:rPr>
+          <w:t>2.1.2.</w:t>
+        </w:r>
+        <w:r>
+          <w:rPr>
+            <w:rFonts w:eastAsiaTheme="minorEastAsia" w:cstheme="minorBidi"/>
+            <w:noProof/>
+            <w:kern w:val="2"/>
+            <w14:ligatures w14:val="standardContextual"/>
+          </w:rPr>
+          <w:tab/>
+        </w:r>
+        <w:r>
+          <w:rPr>
+            <w:rStyle w:val="Hipervnculo"/>
+            <w:noProof/>
+          </w:rPr>
+          <w:t>Descripción de la cohorte</w:t>
+        </w:r>
+        <w:r>
+          <w:rPr>
+            <w:noProof/>
+            <w:webHidden/>
+          </w:rPr>
+          <w:tab/>
+        </w:r>
+        <w:r>
+          <w:rPr>
+            <w:noProof/>
+            <w:webHidden/>
+          </w:rPr>
+          <w:fldChar w:fldCharType="begin"/>
+        </w:r>
+        <w:r>
+          <w:rPr>
+            <w:noProof/>
+            <w:webHidden/>
+          </w:rPr>
+          <w:instrText xml:space="preserve"> PAGEREF _Toc228992848 \h </w:instrText>
+        </w:r>
+        <w:r>
+          <w:rPr>
+            <w:noProof/>
+            <w:webHidden/>
+          </w:rPr>
+        </w:r>
+        <w:r>
+          <w:rPr>
+            <w:noProof/>
+            <w:webHidden/>
+          </w:rPr>
+          <w:fldChar w:fldCharType="separate"/>
+        </w:r>
+        <w:r>
+          <w:rPr>
+            <w:noProof/>
+            <w:webHidden/>
+          </w:rPr>
+          <w:t>13</w:t>
         </w:r>
         <w:r>
           <w:rPr>
@@ -1456,7 +1540,7 @@
           <w14:ligatures w14:val="standardContextual"/>
         </w:rPr>
       </w:pPr>
-      <w:hyperlink w:anchor="_Toc226279076" w:history="1">
+      <w:hyperlink w:anchor="_Toc228992849" w:history="1">
         <w:r>
           <w:rPr>
             <w:rStyle w:val="Hipervnculo"/>
@@ -1499,7 +1583,7 @@
             <w:noProof/>
             <w:webHidden/>
           </w:rPr>
-          <w:instrText xml:space="preserve"> PAGEREF _Toc226279076 \h </w:instrText>
+          <w:instrText xml:space="preserve"> PAGEREF _Toc228992849 \h </w:instrText>
         </w:r>
         <w:r>
           <w:rPr>
@@ -1519,7 +1603,7 @@
             <w:noProof/>
             <w:webHidden/>
           </w:rPr>
-          <w:t>10</w:t>
+          <w:t>14</w:t>
         </w:r>
         <w:r>
           <w:rPr>
@@ -1544,7 +1628,7 @@
           <w14:ligatures w14:val="standardContextual"/>
         </w:rPr>
       </w:pPr>
-      <w:hyperlink w:anchor="_Toc226279077" w:history="1">
+      <w:hyperlink w:anchor="_Toc228992850" w:history="1">
         <w:r>
           <w:rPr>
             <w:rStyle w:val="Hipervnculo"/>
@@ -1587,7 +1671,7 @@
             <w:noProof/>
             <w:webHidden/>
           </w:rPr>
-          <w:instrText xml:space="preserve"> PAGEREF _Toc226279077 \h </w:instrText>
+          <w:instrText xml:space="preserve"> PAGEREF _Toc228992850 \h </w:instrText>
         </w:r>
         <w:r>
           <w:rPr>
@@ -1607,7 +1691,7 @@
             <w:noProof/>
             <w:webHidden/>
           </w:rPr>
-          <w:t>10</w:t>
+          <w:t>14</w:t>
         </w:r>
         <w:r>
           <w:rPr>
@@ -1632,7 +1716,7 @@
           <w14:ligatures w14:val="standardContextual"/>
         </w:rPr>
       </w:pPr>
-      <w:hyperlink w:anchor="_Toc226279078" w:history="1">
+      <w:hyperlink w:anchor="_Toc228992851" w:history="1">
         <w:r>
           <w:rPr>
             <w:rStyle w:val="Hipervnculo"/>
@@ -1675,7 +1759,7 @@
             <w:noProof/>
             <w:webHidden/>
           </w:rPr>
-          <w:instrText xml:space="preserve"> PAGEREF _Toc226279078 \h </w:instrText>
+          <w:instrText xml:space="preserve"> PAGEREF _Toc228992851 \h </w:instrText>
         </w:r>
         <w:r>
           <w:rPr>
@@ -1695,7 +1779,7 @@
             <w:noProof/>
             <w:webHidden/>
           </w:rPr>
-          <w:t>10</w:t>
+          <w:t>14</w:t>
         </w:r>
         <w:r>
           <w:rPr>
@@ -1720,7 +1804,7 @@
           <w14:ligatures w14:val="standardContextual"/>
         </w:rPr>
       </w:pPr>
-      <w:hyperlink w:anchor="_Toc226279079" w:history="1">
+      <w:hyperlink w:anchor="_Toc228992852" w:history="1">
         <w:r>
           <w:rPr>
             <w:rStyle w:val="Hipervnculo"/>
@@ -1763,7 +1847,7 @@
             <w:noProof/>
             <w:webHidden/>
           </w:rPr>
-          <w:instrText xml:space="preserve"> PAGEREF _Toc226279079 \h </w:instrText>
+          <w:instrText xml:space="preserve"> PAGEREF _Toc228992852 \h </w:instrText>
         </w:r>
         <w:r>
           <w:rPr>
@@ -1783,7 +1867,7 @@
             <w:noProof/>
             <w:webHidden/>
           </w:rPr>
-          <w:t>10</w:t>
+          <w:t>14</w:t>
         </w:r>
         <w:r>
           <w:rPr>
@@ -1808,7 +1892,7 @@
           <w14:ligatures w14:val="standardContextual"/>
         </w:rPr>
       </w:pPr>
-      <w:hyperlink w:anchor="_Toc226279080" w:history="1">
+      <w:hyperlink w:anchor="_Toc228992853" w:history="1">
         <w:r>
           <w:rPr>
             <w:rStyle w:val="Hipervnculo"/>
@@ -1851,7 +1935,7 @@
             <w:noProof/>
             <w:webHidden/>
           </w:rPr>
-          <w:instrText xml:space="preserve"> PAGEREF _Toc226279080 \h </w:instrText>
+          <w:instrText xml:space="preserve"> PAGEREF _Toc228992853 \h </w:instrText>
         </w:r>
         <w:r>
           <w:rPr>
@@ -1871,7 +1955,7 @@
             <w:noProof/>
             <w:webHidden/>
           </w:rPr>
-          <w:t>10</w:t>
+          <w:t>14</w:t>
         </w:r>
         <w:r>
           <w:rPr>
@@ -1896,7 +1980,7 @@
           <w14:ligatures w14:val="standardContextual"/>
         </w:rPr>
       </w:pPr>
-      <w:hyperlink w:anchor="_Toc226279081" w:history="1">
+      <w:hyperlink w:anchor="_Toc228992854" w:history="1">
         <w:r>
           <w:rPr>
             <w:rStyle w:val="Hipervnculo"/>
@@ -1939,7 +2023,7 @@
             <w:noProof/>
             <w:webHidden/>
           </w:rPr>
-          <w:instrText xml:space="preserve"> PAGEREF _Toc226279081 \h </w:instrText>
+          <w:instrText xml:space="preserve"> PAGEREF _Toc228992854 \h </w:instrText>
         </w:r>
         <w:r>
           <w:rPr>
@@ -1959,7 +2043,7 @@
             <w:noProof/>
             <w:webHidden/>
           </w:rPr>
-          <w:t>11</w:t>
+          <w:t>15</w:t>
         </w:r>
         <w:r>
           <w:rPr>
@@ -1984,7 +2068,7 @@
           <w14:ligatures w14:val="standardContextual"/>
         </w:rPr>
       </w:pPr>
-      <w:hyperlink w:anchor="_Toc226279082" w:history="1">
+      <w:hyperlink w:anchor="_Toc228992855" w:history="1">
         <w:r>
           <w:rPr>
             <w:rStyle w:val="Hipervnculo"/>
@@ -2027,7 +2111,7 @@
             <w:noProof/>
             <w:webHidden/>
           </w:rPr>
-          <w:instrText xml:space="preserve"> PAGEREF _Toc226279082 \h </w:instrText>
+          <w:instrText xml:space="preserve"> PAGEREF _Toc228992855 \h </w:instrText>
         </w:r>
         <w:r>
           <w:rPr>
@@ -2047,7 +2131,7 @@
             <w:noProof/>
             <w:webHidden/>
           </w:rPr>
-          <w:t>11</w:t>
+          <w:t>15</w:t>
         </w:r>
         <w:r>
           <w:rPr>
@@ -2072,7 +2156,7 @@
           <w14:ligatures w14:val="standardContextual"/>
         </w:rPr>
       </w:pPr>
-      <w:hyperlink w:anchor="_Toc226279083" w:history="1">
+      <w:hyperlink w:anchor="_Toc228992856" w:history="1">
         <w:r>
           <w:rPr>
             <w:rStyle w:val="Hipervnculo"/>
@@ -2115,7 +2199,7 @@
             <w:noProof/>
             <w:webHidden/>
           </w:rPr>
-          <w:instrText xml:space="preserve"> PAGEREF _Toc226279083 \h </w:instrText>
+          <w:instrText xml:space="preserve"> PAGEREF _Toc228992856 \h </w:instrText>
         </w:r>
         <w:r>
           <w:rPr>
@@ -2135,7 +2219,7 @@
             <w:noProof/>
             <w:webHidden/>
           </w:rPr>
-          <w:t>11</w:t>
+          <w:t>15</w:t>
         </w:r>
         <w:r>
           <w:rPr>
@@ -2160,7 +2244,7 @@
           <w14:ligatures w14:val="standardContextual"/>
         </w:rPr>
       </w:pPr>
-      <w:hyperlink w:anchor="_Toc226279084" w:history="1">
+      <w:hyperlink w:anchor="_Toc228992857" w:history="1">
         <w:r>
           <w:rPr>
             <w:rStyle w:val="Hipervnculo"/>
@@ -2203,7 +2287,7 @@
             <w:noProof/>
             <w:webHidden/>
           </w:rPr>
-          <w:instrText xml:space="preserve"> PAGEREF _Toc226279084 \h </w:instrText>
+          <w:instrText xml:space="preserve"> PAGEREF _Toc228992857 \h </w:instrText>
         </w:r>
         <w:r>
           <w:rPr>
@@ -2223,7 +2307,7 @@
             <w:noProof/>
             <w:webHidden/>
           </w:rPr>
-          <w:t>11</w:t>
+          <w:t>15</w:t>
         </w:r>
         <w:r>
           <w:rPr>
@@ -2248,7 +2332,7 @@
           <w14:ligatures w14:val="standardContextual"/>
         </w:rPr>
       </w:pPr>
-      <w:hyperlink w:anchor="_Toc226279085" w:history="1">
+      <w:hyperlink w:anchor="_Toc228992858" w:history="1">
         <w:r>
           <w:rPr>
             <w:rStyle w:val="Hipervnculo"/>
@@ -2291,7 +2375,7 @@
             <w:noProof/>
             <w:webHidden/>
           </w:rPr>
-          <w:instrText xml:space="preserve"> PAGEREF _Toc226279085 \h </w:instrText>
+          <w:instrText xml:space="preserve"> PAGEREF _Toc228992858 \h </w:instrText>
         </w:r>
         <w:r>
           <w:rPr>
@@ -2311,7 +2395,7 @@
             <w:noProof/>
             <w:webHidden/>
           </w:rPr>
-          <w:t>11</w:t>
+          <w:t>15</w:t>
         </w:r>
         <w:r>
           <w:rPr>
@@ -2336,7 +2420,7 @@
           <w14:ligatures w14:val="standardContextual"/>
         </w:rPr>
       </w:pPr>
-      <w:hyperlink w:anchor="_Toc226279086" w:history="1">
+      <w:hyperlink w:anchor="_Toc228992859" w:history="1">
         <w:r>
           <w:rPr>
             <w:rStyle w:val="Hipervnculo"/>
@@ -2379,7 +2463,7 @@
             <w:noProof/>
             <w:webHidden/>
           </w:rPr>
-          <w:instrText xml:space="preserve"> PAGEREF _Toc226279086 \h </w:instrText>
+          <w:instrText xml:space="preserve"> PAGEREF _Toc228992859 \h </w:instrText>
         </w:r>
         <w:r>
           <w:rPr>
@@ -2399,7 +2483,7 @@
             <w:noProof/>
             <w:webHidden/>
           </w:rPr>
-          <w:t>11</w:t>
+          <w:t>15</w:t>
         </w:r>
         <w:r>
           <w:rPr>
@@ -2424,7 +2508,7 @@
           <w14:ligatures w14:val="standardContextual"/>
         </w:rPr>
       </w:pPr>
-      <w:hyperlink w:anchor="_Toc226279087" w:history="1">
+      <w:hyperlink w:anchor="_Toc228992860" w:history="1">
         <w:r>
           <w:rPr>
             <w:rStyle w:val="Hipervnculo"/>
@@ -2467,7 +2551,7 @@
             <w:noProof/>
             <w:webHidden/>
           </w:rPr>
-          <w:instrText xml:space="preserve"> PAGEREF _Toc226279087 \h </w:instrText>
+          <w:instrText xml:space="preserve"> PAGEREF _Toc228992860 \h </w:instrText>
         </w:r>
         <w:r>
           <w:rPr>
@@ -2487,7 +2571,7 @@
             <w:noProof/>
             <w:webHidden/>
           </w:rPr>
-          <w:t>11</w:t>
+          <w:t>15</w:t>
         </w:r>
         <w:r>
           <w:rPr>
@@ -2512,7 +2596,7 @@
           <w14:ligatures w14:val="standardContextual"/>
         </w:rPr>
       </w:pPr>
-      <w:hyperlink w:anchor="_Toc226279088" w:history="1">
+      <w:hyperlink w:anchor="_Toc228992861" w:history="1">
         <w:r>
           <w:rPr>
             <w:rStyle w:val="Hipervnculo"/>
@@ -2555,7 +2639,7 @@
             <w:noProof/>
             <w:webHidden/>
           </w:rPr>
-          <w:instrText xml:space="preserve"> PAGEREF _Toc226279088 \h </w:instrText>
+          <w:instrText xml:space="preserve"> PAGEREF _Toc228992861 \h </w:instrText>
         </w:r>
         <w:r>
           <w:rPr>
@@ -2575,7 +2659,7 @@
             <w:noProof/>
             <w:webHidden/>
           </w:rPr>
-          <w:t>11</w:t>
+          <w:t>15</w:t>
         </w:r>
         <w:r>
           <w:rPr>
@@ -2600,7 +2684,7 @@
           <w14:ligatures w14:val="standardContextual"/>
         </w:rPr>
       </w:pPr>
-      <w:hyperlink w:anchor="_Toc226279089" w:history="1">
+      <w:hyperlink w:anchor="_Toc228992862" w:history="1">
         <w:r>
           <w:rPr>
             <w:rStyle w:val="Hipervnculo"/>
@@ -2643,7 +2727,7 @@
             <w:noProof/>
             <w:webHidden/>
           </w:rPr>
-          <w:instrText xml:space="preserve"> PAGEREF _Toc226279089 \h </w:instrText>
+          <w:instrText xml:space="preserve"> PAGEREF _Toc228992862 \h </w:instrText>
         </w:r>
         <w:r>
           <w:rPr>
@@ -2663,7 +2747,7 @@
             <w:noProof/>
             <w:webHidden/>
           </w:rPr>
-          <w:t>11</w:t>
+          <w:t>15</w:t>
         </w:r>
         <w:r>
           <w:rPr>
@@ -2688,7 +2772,7 @@
           <w14:ligatures w14:val="standardContextual"/>
         </w:rPr>
       </w:pPr>
-      <w:hyperlink w:anchor="_Toc226279090" w:history="1">
+      <w:hyperlink w:anchor="_Toc228992863" w:history="1">
         <w:r>
           <w:rPr>
             <w:rStyle w:val="Hipervnculo"/>
@@ -2731,7 +2815,7 @@
             <w:noProof/>
             <w:webHidden/>
           </w:rPr>
-          <w:instrText xml:space="preserve"> PAGEREF _Toc226279090 \h </w:instrText>
+          <w:instrText xml:space="preserve"> PAGEREF _Toc228992863 \h </w:instrText>
         </w:r>
         <w:r>
           <w:rPr>
@@ -2751,7 +2835,7 @@
             <w:noProof/>
             <w:webHidden/>
           </w:rPr>
-          <w:t>12</w:t>
+          <w:t>16</w:t>
         </w:r>
         <w:r>
           <w:rPr>
@@ -2776,7 +2860,7 @@
           <w14:ligatures w14:val="standardContextual"/>
         </w:rPr>
       </w:pPr>
-      <w:hyperlink w:anchor="_Toc226279091" w:history="1">
+      <w:hyperlink w:anchor="_Toc228992864" w:history="1">
         <w:r>
           <w:rPr>
             <w:rStyle w:val="Hipervnculo"/>
@@ -2819,7 +2903,7 @@
             <w:noProof/>
             <w:webHidden/>
           </w:rPr>
-          <w:instrText xml:space="preserve"> PAGEREF _Toc226279091 \h </w:instrText>
+          <w:instrText xml:space="preserve"> PAGEREF _Toc228992864 \h </w:instrText>
         </w:r>
         <w:r>
           <w:rPr>
@@ -2839,7 +2923,7 @@
             <w:noProof/>
             <w:webHidden/>
           </w:rPr>
-          <w:t>12</w:t>
+          <w:t>16</w:t>
         </w:r>
         <w:r>
           <w:rPr>
@@ -2864,7 +2948,7 @@
           <w14:ligatures w14:val="standardContextual"/>
         </w:rPr>
       </w:pPr>
-      <w:hyperlink w:anchor="_Toc226279092" w:history="1">
+      <w:hyperlink w:anchor="_Toc228992865" w:history="1">
         <w:r>
           <w:rPr>
             <w:rStyle w:val="Hipervnculo"/>
@@ -2907,7 +2991,7 @@
             <w:noProof/>
             <w:webHidden/>
           </w:rPr>
-          <w:instrText xml:space="preserve"> PAGEREF _Toc226279092 \h </w:instrText>
+          <w:instrText xml:space="preserve"> PAGEREF _Toc228992865 \h </w:instrText>
         </w:r>
         <w:r>
           <w:rPr>
@@ -2927,7 +3011,7 @@
             <w:noProof/>
             <w:webHidden/>
           </w:rPr>
-          <w:t>12</w:t>
+          <w:t>16</w:t>
         </w:r>
         <w:r>
           <w:rPr>
@@ -2952,7 +3036,7 @@
           <w14:ligatures w14:val="standardContextual"/>
         </w:rPr>
       </w:pPr>
-      <w:hyperlink w:anchor="_Toc226279093" w:history="1">
+      <w:hyperlink w:anchor="_Toc228992866" w:history="1">
         <w:r>
           <w:rPr>
             <w:rStyle w:val="Hipervnculo"/>
@@ -2995,7 +3079,7 @@
             <w:noProof/>
             <w:webHidden/>
           </w:rPr>
-          <w:instrText xml:space="preserve"> PAGEREF _Toc226279093 \h </w:instrText>
+          <w:instrText xml:space="preserve"> PAGEREF _Toc228992866 \h </w:instrText>
         </w:r>
         <w:r>
           <w:rPr>
@@ -3015,7 +3099,7 @@
             <w:noProof/>
             <w:webHidden/>
           </w:rPr>
-          <w:t>12</w:t>
+          <w:t>16</w:t>
         </w:r>
         <w:r>
           <w:rPr>
@@ -3040,7 +3124,7 @@
           <w14:ligatures w14:val="standardContextual"/>
         </w:rPr>
       </w:pPr>
-      <w:hyperlink w:anchor="_Toc226279094" w:history="1">
+      <w:hyperlink w:anchor="_Toc228992867" w:history="1">
         <w:r>
           <w:rPr>
             <w:rStyle w:val="Hipervnculo"/>
@@ -3083,7 +3167,7 @@
             <w:noProof/>
             <w:webHidden/>
           </w:rPr>
-          <w:instrText xml:space="preserve"> PAGEREF _Toc226279094 \h </w:instrText>
+          <w:instrText xml:space="preserve"> PAGEREF _Toc228992867 \h </w:instrText>
         </w:r>
         <w:r>
           <w:rPr>
@@ -3103,7 +3187,7 @@
             <w:noProof/>
             <w:webHidden/>
           </w:rPr>
-          <w:t>12</w:t>
+          <w:t>16</w:t>
         </w:r>
         <w:r>
           <w:rPr>
@@ -3128,7 +3212,7 @@
           <w14:ligatures w14:val="standardContextual"/>
         </w:rPr>
       </w:pPr>
-      <w:hyperlink w:anchor="_Toc226279095" w:history="1">
+      <w:hyperlink w:anchor="_Toc228992868" w:history="1">
         <w:r>
           <w:rPr>
             <w:rStyle w:val="Hipervnculo"/>
@@ -3171,7 +3255,7 @@
             <w:noProof/>
             <w:webHidden/>
           </w:rPr>
-          <w:instrText xml:space="preserve"> PAGEREF _Toc226279095 \h </w:instrText>
+          <w:instrText xml:space="preserve"> PAGEREF _Toc228992868 \h </w:instrText>
         </w:r>
         <w:r>
           <w:rPr>
@@ -3191,7 +3275,7 @@
             <w:noProof/>
             <w:webHidden/>
           </w:rPr>
-          <w:t>12</w:t>
+          <w:t>16</w:t>
         </w:r>
         <w:r>
           <w:rPr>
@@ -3216,7 +3300,7 @@
           <w14:ligatures w14:val="standardContextual"/>
         </w:rPr>
       </w:pPr>
-      <w:hyperlink w:anchor="_Toc226279096" w:history="1">
+      <w:hyperlink w:anchor="_Toc228992869" w:history="1">
         <w:r>
           <w:rPr>
             <w:rStyle w:val="Hipervnculo"/>
@@ -3259,7 +3343,7 @@
             <w:noProof/>
             <w:webHidden/>
           </w:rPr>
-          <w:instrText xml:space="preserve"> PAGEREF _Toc226279096 \h </w:instrText>
+          <w:instrText xml:space="preserve"> PAGEREF _Toc228992869 \h </w:instrText>
         </w:r>
         <w:r>
           <w:rPr>
@@ -3279,7 +3363,7 @@
             <w:noProof/>
             <w:webHidden/>
           </w:rPr>
-          <w:t>12</w:t>
+          <w:t>16</w:t>
         </w:r>
         <w:r>
           <w:rPr>
@@ -3304,7 +3388,7 @@
           <w14:ligatures w14:val="standardContextual"/>
         </w:rPr>
       </w:pPr>
-      <w:hyperlink w:anchor="_Toc226279097" w:history="1">
+      <w:hyperlink w:anchor="_Toc228992870" w:history="1">
         <w:r>
           <w:rPr>
             <w:rStyle w:val="Hipervnculo"/>
@@ -3347,7 +3431,7 @@
             <w:noProof/>
             <w:webHidden/>
           </w:rPr>
-          <w:instrText xml:space="preserve"> PAGEREF _Toc226279097 \h </w:instrText>
+          <w:instrText xml:space="preserve"> PAGEREF _Toc228992870 \h </w:instrText>
         </w:r>
         <w:r>
           <w:rPr>
@@ -3367,7 +3451,7 @@
             <w:noProof/>
             <w:webHidden/>
           </w:rPr>
-          <w:t>13</w:t>
+          <w:t>17</w:t>
         </w:r>
         <w:r>
           <w:rPr>
@@ -3392,7 +3476,7 @@
           <w14:ligatures w14:val="standardContextual"/>
         </w:rPr>
       </w:pPr>
-      <w:hyperlink w:anchor="_Toc226279098" w:history="1">
+      <w:hyperlink w:anchor="_Toc228992871" w:history="1">
         <w:r>
           <w:rPr>
             <w:rStyle w:val="Hipervnculo"/>
@@ -3435,7 +3519,7 @@
             <w:noProof/>
             <w:webHidden/>
           </w:rPr>
-          <w:instrText xml:space="preserve"> PAGEREF _Toc226279098 \h </w:instrText>
+          <w:instrText xml:space="preserve"> PAGEREF _Toc228992871 \h </w:instrText>
         </w:r>
         <w:r>
           <w:rPr>
@@ -3455,7 +3539,7 @@
             <w:noProof/>
             <w:webHidden/>
           </w:rPr>
-          <w:t>13</w:t>
+          <w:t>17</w:t>
         </w:r>
         <w:r>
           <w:rPr>
@@ -3480,7 +3564,7 @@
           <w14:ligatures w14:val="standardContextual"/>
         </w:rPr>
       </w:pPr>
-      <w:hyperlink w:anchor="_Toc226279099" w:history="1">
+      <w:hyperlink w:anchor="_Toc228992872" w:history="1">
         <w:r>
           <w:rPr>
             <w:rStyle w:val="Hipervnculo"/>
@@ -3523,7 +3607,7 @@
             <w:noProof/>
             <w:webHidden/>
           </w:rPr>
-          <w:instrText xml:space="preserve"> PAGEREF _Toc226279099 \h </w:instrText>
+          <w:instrText xml:space="preserve"> PAGEREF _Toc228992872 \h </w:instrText>
         </w:r>
         <w:r>
           <w:rPr>
@@ -3543,7 +3627,7 @@
             <w:noProof/>
             <w:webHidden/>
           </w:rPr>
-          <w:t>13</w:t>
+          <w:t>17</w:t>
         </w:r>
         <w:r>
           <w:rPr>
@@ -3568,7 +3652,7 @@
           <w14:ligatures w14:val="standardContextual"/>
         </w:rPr>
       </w:pPr>
-      <w:hyperlink w:anchor="_Toc226279100" w:history="1">
+      <w:hyperlink w:anchor="_Toc228992873" w:history="1">
         <w:r>
           <w:rPr>
             <w:rStyle w:val="Hipervnculo"/>
@@ -3611,7 +3695,7 @@
             <w:noProof/>
             <w:webHidden/>
           </w:rPr>
-          <w:instrText xml:space="preserve"> PAGEREF _Toc226279100 \h </w:instrText>
+          <w:instrText xml:space="preserve"> PAGEREF _Toc228992873 \h </w:instrText>
         </w:r>
         <w:r>
           <w:rPr>
@@ -3631,7 +3715,7 @@
             <w:noProof/>
             <w:webHidden/>
           </w:rPr>
-          <w:t>13</w:t>
+          <w:t>17</w:t>
         </w:r>
         <w:r>
           <w:rPr>
@@ -3656,7 +3740,7 @@
           <w14:ligatures w14:val="standardContextual"/>
         </w:rPr>
       </w:pPr>
-      <w:hyperlink w:anchor="_Toc226279101" w:history="1">
+      <w:hyperlink w:anchor="_Toc228992874" w:history="1">
         <w:r>
           <w:rPr>
             <w:rStyle w:val="Hipervnculo"/>
@@ -3699,7 +3783,7 @@
             <w:noProof/>
             <w:webHidden/>
           </w:rPr>
-          <w:instrText xml:space="preserve"> PAGEREF _Toc226279101 \h </w:instrText>
+          <w:instrText xml:space="preserve"> PAGEREF _Toc228992874 \h </w:instrText>
         </w:r>
         <w:r>
           <w:rPr>
@@ -3719,7 +3803,7 @@
             <w:noProof/>
             <w:webHidden/>
           </w:rPr>
-          <w:t>13</w:t>
+          <w:t>17</w:t>
         </w:r>
         <w:r>
           <w:rPr>
@@ -3743,7 +3827,7 @@
           <w14:ligatures w14:val="standardContextual"/>
         </w:rPr>
       </w:pPr>
-      <w:hyperlink w:anchor="_Toc226279102" w:history="1">
+      <w:hyperlink w:anchor="_Toc228992875" w:history="1">
         <w:r>
           <w:rPr>
             <w:rStyle w:val="Hipervnculo"/>
@@ -3770,7 +3854,7 @@
             <w:noProof/>
             <w:webHidden/>
           </w:rPr>
-          <w:instrText xml:space="preserve"> PAGEREF _Toc226279102 \h </w:instrText>
+          <w:instrText xml:space="preserve"> PAGEREF _Toc228992875 \h </w:instrText>
         </w:r>
         <w:r>
           <w:rPr>
@@ -3790,7 +3874,7 @@
             <w:noProof/>
             <w:webHidden/>
           </w:rPr>
-          <w:t>14</w:t>
+          <w:t>18</w:t>
         </w:r>
         <w:r>
           <w:rPr>
@@ -3815,7 +3899,7 @@
           <w14:ligatures w14:val="standardContextual"/>
         </w:rPr>
       </w:pPr>
-      <w:hyperlink w:anchor="_Toc226279103" w:history="1">
+      <w:hyperlink w:anchor="_Toc228992876" w:history="1">
         <w:r>
           <w:rPr>
             <w:rStyle w:val="Hipervnculo"/>
@@ -3858,7 +3942,7 @@
             <w:noProof/>
             <w:webHidden/>
           </w:rPr>
-          <w:instrText xml:space="preserve"> PAGEREF _Toc226279103 \h </w:instrText>
+          <w:instrText xml:space="preserve"> PAGEREF _Toc228992876 \h </w:instrText>
         </w:r>
         <w:r>
           <w:rPr>
@@ -3878,7 +3962,7 @@
             <w:noProof/>
             <w:webHidden/>
           </w:rPr>
-          <w:t>15</w:t>
+          <w:t>19</w:t>
         </w:r>
         <w:r>
           <w:rPr>
@@ -4045,8 +4129,8 @@
         <w:rPr>
           <w:rFonts w:eastAsiaTheme="minorEastAsia" w:cstheme="minorBidi"/>
           <w:noProof/>
-          <w:sz w:val="22"/>
-          <w:szCs w:val="22"/>
+          <w:kern w:val="2"/>
+          <w14:ligatures w14:val="standardContextual"/>
         </w:rPr>
       </w:pPr>
       <w:r>
@@ -4058,7 +4142,7 @@
       <w:r>
         <w:fldChar w:fldCharType="separate"/>
       </w:r>
-      <w:hyperlink w:anchor="_Toc20304757" w:history="1">
+      <w:hyperlink w:anchor="_Toc228992877" w:history="1">
         <w:r>
           <w:rPr>
             <w:rStyle w:val="Hipervnculo"/>
@@ -4085,7 +4169,7 @@
             <w:noProof/>
             <w:webHidden/>
           </w:rPr>
-          <w:instrText xml:space="preserve"> PAGEREF _Toc20304757 \h </w:instrText>
+          <w:instrText xml:space="preserve"> PAGEREF _Toc228992877 \h </w:instrText>
         </w:r>
         <w:r>
           <w:rPr>
@@ -4118,6 +4202,77 @@
     </w:p>
     <w:p>
       <w:pPr>
+        <w:pStyle w:val="Tabladeilustraciones"/>
+        <w:tabs>
+          <w:tab w:val="right" w:leader="dot" w:pos="9061"/>
+        </w:tabs>
+        <w:rPr>
+          <w:rFonts w:eastAsiaTheme="minorEastAsia" w:cstheme="minorBidi"/>
+          <w:noProof/>
+          <w:kern w:val="2"/>
+          <w14:ligatures w14:val="standardContextual"/>
+        </w:rPr>
+      </w:pPr>
+      <w:hyperlink w:anchor="_Toc228992878" w:history="1">
+        <w:r>
+          <w:rPr>
+            <w:rStyle w:val="Hipervnculo"/>
+            <w:noProof/>
+          </w:rPr>
+          <w:t>Tabla 1. Resumen de los datasets de RNA-seq integrados y características del diseño experimental.</w:t>
+        </w:r>
+        <w:r>
+          <w:rPr>
+            <w:noProof/>
+            <w:webHidden/>
+          </w:rPr>
+          <w:tab/>
+        </w:r>
+        <w:r>
+          <w:rPr>
+            <w:noProof/>
+            <w:webHidden/>
+          </w:rPr>
+          <w:fldChar w:fldCharType="begin"/>
+        </w:r>
+        <w:r>
+          <w:rPr>
+            <w:noProof/>
+            <w:webHidden/>
+          </w:rPr>
+          <w:instrText xml:space="preserve"> PAGEREF _Toc228992878 \h </w:instrText>
+        </w:r>
+        <w:r>
+          <w:rPr>
+            <w:noProof/>
+            <w:webHidden/>
+          </w:rPr>
+        </w:r>
+        <w:r>
+          <w:rPr>
+            <w:noProof/>
+            <w:webHidden/>
+          </w:rPr>
+          <w:fldChar w:fldCharType="separate"/>
+        </w:r>
+        <w:r>
+          <w:rPr>
+            <w:noProof/>
+            <w:webHidden/>
+          </w:rPr>
+          <w:t>13</w:t>
+        </w:r>
+        <w:r>
+          <w:rPr>
+            <w:noProof/>
+            <w:webHidden/>
+          </w:rPr>
+          <w:fldChar w:fldCharType="end"/>
+        </w:r>
+      </w:hyperlink>
+    </w:p>
+    <w:p>
+      <w:pPr>
         <w:pStyle w:val="TtuloTDC"/>
       </w:pPr>
       <w:r>
@@ -4132,7 +4287,7 @@
       <w:r>
         <w:br w:type="page"/>
       </w:r>
-      <w:bookmarkStart w:id="1" w:name="_Toc226279068"/>
+      <w:bookmarkStart w:id="1" w:name="_Toc228992840"/>
       <w:r>
         <w:rPr>
           <w:caps w:val="0"/>
@@ -4166,7 +4321,7 @@
       <w:pPr>
         <w:pStyle w:val="Ttulo2"/>
       </w:pPr>
-      <w:bookmarkStart w:id="2" w:name="_Toc226279069"/>
+      <w:bookmarkStart w:id="2" w:name="_Toc228992841"/>
       <w:r>
         <w:rPr>
           <w:caps w:val="0"/>
@@ -4197,7 +4352,7 @@
         <w:pStyle w:val="TtuloTDC"/>
       </w:pPr>
       <w:bookmarkStart w:id="3" w:name="_Toc437521370"/>
-      <w:bookmarkStart w:id="4" w:name="_Toc20304757"/>
+      <w:bookmarkStart w:id="4" w:name="_Toc228992877"/>
       <w:r>
         <w:t xml:space="preserve">Tabla </w:t>
       </w:r>
@@ -4480,7 +4635,7 @@
       <w:pPr>
         <w:pStyle w:val="Ttulo2"/>
       </w:pPr>
-      <w:bookmarkStart w:id="5" w:name="_Toc226279070"/>
+      <w:bookmarkStart w:id="5" w:name="_Toc228992842"/>
       <w:r>
         <w:rPr>
           <w:caps w:val="0"/>
@@ -4500,7 +4655,7 @@
       </w:pPr>
       <w:bookmarkStart w:id="6" w:name="_Toc437515559"/>
       <w:bookmarkStart w:id="7" w:name="_Toc14106981"/>
-      <w:bookmarkStart w:id="8" w:name="_Toc226279071"/>
+      <w:bookmarkStart w:id="8" w:name="_Toc228992843"/>
       <w:r>
         <w:lastRenderedPageBreak/>
         <w:t>“</w:t>
@@ -4688,7 +4843,7 @@
       <w:pPr>
         <w:pStyle w:val="Ttulo2"/>
       </w:pPr>
-      <w:bookmarkStart w:id="25" w:name="_Toc226279072"/>
+      <w:bookmarkStart w:id="25" w:name="_Toc228992844"/>
       <w:r>
         <w:rPr>
           <w:caps w:val="0"/>
@@ -4710,7 +4865,7 @@
       <w:pPr>
         <w:pStyle w:val="Ttulo1"/>
       </w:pPr>
-      <w:bookmarkStart w:id="26" w:name="_Toc226279073"/>
+      <w:bookmarkStart w:id="26" w:name="_Toc228992845"/>
       <w:r>
         <w:rPr>
           <w:caps w:val="0"/>
@@ -4727,12 +4882,14 @@
           <w:caps w:val="0"/>
         </w:rPr>
       </w:pPr>
+      <w:bookmarkStart w:id="27" w:name="_Toc228992846"/>
       <w:r>
         <w:rPr>
           <w:caps w:val="0"/>
         </w:rPr>
         <w:t>Obtención de los Datos y Criterios de Selección</w:t>
       </w:r>
+      <w:bookmarkEnd w:id="27"/>
     </w:p>
     <w:p>
       <w:r>
@@ -4743,37 +4900,15 @@
       <w:pPr>
         <w:pStyle w:val="Ttulo3"/>
       </w:pPr>
+      <w:bookmarkStart w:id="28" w:name="_Toc228992847"/>
       <w:r>
         <w:t>Fuente de datos</w:t>
       </w:r>
-    </w:p>
-    <w:p>
-      <w:r>
-        <w:t xml:space="preserve">Las bases de datos consultadas en esta investigación son de carácter público, específicamente los repositorios NCBI Gene </w:t>
-      </w:r>
-      <w:proofErr w:type="spellStart"/>
-      <w:r>
-        <w:t>Expression</w:t>
-      </w:r>
-      <w:proofErr w:type="spellEnd"/>
-      <w:r>
-        <w:t xml:space="preserve"> </w:t>
-      </w:r>
-      <w:proofErr w:type="spellStart"/>
-      <w:r>
-        <w:t>Omnibus</w:t>
-      </w:r>
-      <w:proofErr w:type="spellEnd"/>
-      <w:r>
-        <w:t xml:space="preserve"> (GEO) y The Cancer </w:t>
-      </w:r>
-      <w:proofErr w:type="spellStart"/>
-      <w:r>
-        <w:t>Genome</w:t>
-      </w:r>
-      <w:proofErr w:type="spellEnd"/>
-      <w:r>
-        <w:t xml:space="preserve"> Atlas (TCGA). Al trabajar con datos secundarios de acceso abierto, no se ha requerido la obtención de consentimientos informados adicionales ni compromisos de confidencialidad específicos, dado que el anonimato de los participantes originales está plenamente garantizado por los protocolos de los repositorios de origen</w:t>
+      <w:bookmarkEnd w:id="28"/>
+    </w:p>
+    <w:p>
+      <w:r>
+        <w:t>Las bases de datos consultadas en esta investigación son de carácter público, específicamente los repositorios NCBI Gene Expression Omnibus (GEO) y The Cancer Genome Atlas (TCGA). Al trabajar con datos secundarios de acceso abierto, no se ha requerido la obtención de consentimientos informados adicionales ni compromisos de confidencialidad específicos, dado que el anonimato de los participantes originales está plenamente garantizado por los protocolos de los repositorios de origen</w:t>
       </w:r>
       <w:r>
         <w:t>.</w:t>
@@ -4862,17 +4997,8 @@
           <w:i/>
           <w:iCs/>
         </w:rPr>
-        <w:t>Bulk RNA-</w:t>
-      </w:r>
-      <w:proofErr w:type="spellStart"/>
-      <w:r>
-        <w:rPr>
-          <w:i/>
-          <w:iCs/>
-        </w:rPr>
-        <w:t>seq</w:t>
-      </w:r>
-      <w:proofErr w:type="spellEnd"/>
+        <w:t>Bulk RNA-seq</w:t>
+      </w:r>
       <w:r>
         <w:t>).</w:t>
       </w:r>
@@ -4921,23 +5047,7 @@
         <w:t>Naturaleza de los Datos</w:t>
       </w:r>
       <w:r>
-        <w:t>: Disponibilidad de matrices de conteos crudos (Raw Counts) en formatos .</w:t>
-      </w:r>
-      <w:proofErr w:type="spellStart"/>
-      <w:r>
-        <w:t>csv</w:t>
-      </w:r>
-      <w:proofErr w:type="spellEnd"/>
-      <w:r>
-        <w:t>, .</w:t>
-      </w:r>
-      <w:proofErr w:type="spellStart"/>
-      <w:r>
-        <w:t>txt</w:t>
-      </w:r>
-      <w:proofErr w:type="spellEnd"/>
-      <w:r>
-        <w:t xml:space="preserve"> o .xlsx.</w:t>
+        <w:t>: Disponibilidad de matrices de conteos crudos (Raw Counts) en formatos .csv, .txt o .xlsx.</w:t>
       </w:r>
       <w:r>
         <w:t xml:space="preserve"> Esto implica que las matrices están compuestas por </w:t>
@@ -4989,15 +5099,7 @@
         <w:t>Datos de Lectura Primaria (Archivos FASTQ)</w:t>
       </w:r>
       <w:r>
-        <w:t xml:space="preserve">: Se excluyó el procesamiento inicial de lecturas crudas y el correspondiente flujo de preprocesamiento (control de calidad de lecturas, </w:t>
-      </w:r>
-      <w:proofErr w:type="spellStart"/>
-      <w:r>
-        <w:t>trimming</w:t>
-      </w:r>
-      <w:proofErr w:type="spellEnd"/>
-      <w:r>
-        <w:t>, alineamiento genómico y cuantificación). Esta decisión se fundamenta en la limitación de recursos computacionales de alto rendimiento</w:t>
+        <w:t>: Se excluyó el procesamiento inicial de lecturas crudas y el correspondiente flujo de preprocesamiento (control de calidad de lecturas, trimming, alineamiento genómico y cuantificación). Esta decisión se fundamenta en la limitación de recursos computacionales de alto rendimiento</w:t>
       </w:r>
       <w:r>
         <w:t xml:space="preserve"> </w:t>
@@ -5025,15 +5127,7 @@
         <w:t>Datos Normalizados</w:t>
       </w:r>
       <w:r>
-        <w:t xml:space="preserve">: Se descartaron </w:t>
-      </w:r>
-      <w:proofErr w:type="spellStart"/>
-      <w:r>
-        <w:t>datasets</w:t>
-      </w:r>
-      <w:proofErr w:type="spellEnd"/>
-      <w:r>
-        <w:t xml:space="preserve"> que solo ofrecieran datos procesados, ya que estas normalizaciones externas son incompatibles con el flujo de trabajo de DESeq2.</w:t>
+        <w:t>: Se descartaron datasets que solo ofrecieran datos procesados, ya que estas normalizaciones externas son incompatibles con el flujo de trabajo de DESeq2.</w:t>
       </w:r>
     </w:p>
     <w:p>
@@ -5061,26 +5155,10 @@
         <w:t xml:space="preserve"> Se descartaron específicamente los datos procedentes de </w:t>
       </w:r>
       <w:r>
-        <w:t>micro-ARN (</w:t>
-      </w:r>
-      <w:proofErr w:type="spellStart"/>
-      <w:r>
-        <w:t>miRNA</w:t>
-      </w:r>
-      <w:proofErr w:type="spellEnd"/>
-      <w:r>
-        <w:t>)</w:t>
-      </w:r>
-      <w:r>
-        <w:t>, ARN pequeño nuclear (</w:t>
-      </w:r>
-      <w:proofErr w:type="spellStart"/>
-      <w:r>
-        <w:t>snRNA</w:t>
-      </w:r>
-      <w:proofErr w:type="spellEnd"/>
-      <w:r>
-        <w:t>) y otros tipos de ARN no codificante de cadena corta; debido a que sus perfiles de expresión requieren métodos de normalización y librerías de secuenciación específicas.</w:t>
+        <w:t>micro-ARN (miRNA)</w:t>
+      </w:r>
+      <w:r>
+        <w:t>, ARN pequeño nuclear (snRNA) y otros tipos de ARN no codificante de cadena corta; debido a que sus perfiles de expresión requieren métodos de normalización y librerías de secuenciación específicas.</w:t>
       </w:r>
     </w:p>
     <w:p>
@@ -5136,31 +5214,7 @@
         <w:t>Tecnologías Alternativas</w:t>
       </w:r>
       <w:r>
-        <w:t xml:space="preserve">: Estudios de </w:t>
-      </w:r>
-      <w:proofErr w:type="spellStart"/>
-      <w:r>
-        <w:t>microarrays</w:t>
-      </w:r>
-      <w:proofErr w:type="spellEnd"/>
-      <w:r>
-        <w:t xml:space="preserve"> o de célula única (</w:t>
-      </w:r>
-      <w:proofErr w:type="gramStart"/>
-      <w:r>
-        <w:t>single</w:t>
-      </w:r>
-      <w:proofErr w:type="gramEnd"/>
-      <w:r>
-        <w:t>-</w:t>
-      </w:r>
-      <w:proofErr w:type="spellStart"/>
-      <w:r>
-        <w:t>cell</w:t>
-      </w:r>
-      <w:proofErr w:type="spellEnd"/>
-      <w:r>
-        <w:t>), por requerir pipelines de análisis distintos al objetivo de este estudio.</w:t>
+        <w:t>: Estudios de microarrays o de célula única (single-cell), por requerir pipelines de análisis distintos al objetivo de este estudio.</w:t>
       </w:r>
     </w:p>
     <w:p>
@@ -5190,535 +5244,218 @@
       <w:r>
         <w:t>muestras procedentes de tejidos fijados en parafina, priorizando aquellas obtenidas mediante congelación inmediata (</w:t>
       </w:r>
-      <w:proofErr w:type="spellStart"/>
       <w:r>
         <w:rPr>
           <w:i/>
           <w:iCs/>
         </w:rPr>
-        <w:t>fresh</w:t>
-      </w:r>
-      <w:proofErr w:type="spellEnd"/>
+        <w:t>fresh frozen</w:t>
+      </w:r>
+      <w:r>
+        <w:t>).</w:t>
+      </w:r>
+    </w:p>
+    <w:p>
+      <w:pPr>
+        <w:pStyle w:val="Ttulo4"/>
+      </w:pPr>
+      <w:r>
+        <w:t>Gene Expression Omnibus (GEO)</w:t>
+      </w:r>
+    </w:p>
+    <w:p>
+      <w:r>
+        <w:t>El proceso de búsqueda y selección de datos transcriptómicos se llevó a cabo</w:t>
+      </w:r>
+      <w:r>
+        <w:t xml:space="preserve"> principalmente</w:t>
+      </w:r>
+      <w:r>
+        <w:t xml:space="preserve"> a través del repositorio Gene Expression Omnibus (GEO) del National Center for Biotechnology Information (NCBI). Para localizar los estudios de RNA-seq</w:t>
+      </w:r>
+      <w:r>
+        <w:t xml:space="preserve"> que cumplen los criterios especificados</w:t>
+      </w:r>
+      <w:r>
+        <w:t xml:space="preserve">, se aplicó el filtro de búsqueda </w:t>
+      </w:r>
+      <w:r>
+        <w:t>«(colon cancer[Title] OR colorectal cancer[Title]) AND "Homo sapiens"[Organism] AND "Expression profiling by high throughput sequencing"[All Fields]»</w:t>
+      </w:r>
+      <w:r>
+        <w:t xml:space="preserve"> en el motor de consulta de GEO DataSets.</w:t>
+      </w:r>
+    </w:p>
+    <w:p>
+      <w:r>
+        <w:lastRenderedPageBreak/>
+        <w:t xml:space="preserve">A excepción del </w:t>
+      </w:r>
+      <w:r>
+        <w:t xml:space="preserve">dataset </w:t>
+      </w:r>
+      <w:r>
+        <w:t>GSE164541</w:t>
+      </w:r>
+      <w:r>
+        <w:t>, que proporciona la matriz de conteos crudos en formato .csv, todos los restantes</w:t>
+      </w:r>
+      <w:r>
+        <w:t xml:space="preserve"> (</w:t>
+      </w:r>
+      <w:r>
+        <w:t>GSE50760, GSE92914, GSE104836, GSE142279 y GSE156451</w:t>
+      </w:r>
+      <w:r>
+        <w:t>)</w:t>
+      </w:r>
+      <w:r>
+        <w:t xml:space="preserve"> corresponden con </w:t>
+      </w:r>
+      <w:r>
+        <w:t xml:space="preserve">matrices de conteo preprocesadas de forma estandarizada por el </w:t>
+      </w:r>
       <w:r>
         <w:rPr>
           <w:i/>
           <w:iCs/>
         </w:rPr>
-        <w:t xml:space="preserve"> </w:t>
-      </w:r>
-      <w:proofErr w:type="spellStart"/>
+        <w:t>pipeline</w:t>
+      </w:r>
+      <w:r>
+        <w:t xml:space="preserve"> del NCBI</w:t>
+      </w:r>
+      <w:r>
+        <w:t>.</w:t>
+      </w:r>
+      <w:r>
+        <w:t xml:space="preserve"> Este consiste en el alineamiento de </w:t>
+      </w:r>
+      <w:r>
+        <w:t xml:space="preserve">las ejecuciones de secuenciación del </w:t>
+      </w:r>
       <w:r>
         <w:rPr>
           <w:i/>
           <w:iCs/>
         </w:rPr>
-        <w:t>frozen</w:t>
-      </w:r>
-      <w:proofErr w:type="spellEnd"/>
-      <w:r>
-        <w:t>).</w:t>
-      </w:r>
-    </w:p>
-    <w:p>
-      <w:pPr>
-        <w:pStyle w:val="Ttulo4"/>
-      </w:pPr>
-      <w:r>
-        <w:t xml:space="preserve">Gene </w:t>
-      </w:r>
-      <w:proofErr w:type="spellStart"/>
-      <w:r>
-        <w:t>Expression</w:t>
-      </w:r>
-      <w:proofErr w:type="spellEnd"/>
-      <w:r>
-        <w:t xml:space="preserve"> </w:t>
-      </w:r>
-      <w:proofErr w:type="spellStart"/>
-      <w:r>
-        <w:t>Omnibus</w:t>
-      </w:r>
-      <w:proofErr w:type="spellEnd"/>
-      <w:r>
-        <w:t xml:space="preserve"> (GEO)</w:t>
-      </w:r>
-    </w:p>
-    <w:p>
-      <w:r>
-        <w:t xml:space="preserve">El proceso de búsqueda y selección de datos </w:t>
-      </w:r>
-      <w:proofErr w:type="spellStart"/>
-      <w:r>
-        <w:t>transcriptómicos</w:t>
-      </w:r>
-      <w:proofErr w:type="spellEnd"/>
-      <w:r>
-        <w:t xml:space="preserve"> se llevó a cabo</w:t>
-      </w:r>
-      <w:r>
-        <w:t xml:space="preserve"> principalmente</w:t>
-      </w:r>
-      <w:r>
-        <w:t xml:space="preserve"> a través del repositorio Gene </w:t>
-      </w:r>
-      <w:proofErr w:type="spellStart"/>
-      <w:r>
-        <w:t>Expression</w:t>
-      </w:r>
-      <w:proofErr w:type="spellEnd"/>
-      <w:r>
-        <w:t xml:space="preserve"> </w:t>
-      </w:r>
-      <w:proofErr w:type="spellStart"/>
-      <w:r>
-        <w:t>Omnibus</w:t>
-      </w:r>
-      <w:proofErr w:type="spellEnd"/>
-      <w:r>
-        <w:t xml:space="preserve"> (GEO) del </w:t>
-      </w:r>
-      <w:proofErr w:type="spellStart"/>
-      <w:r>
-        <w:t>National</w:t>
-      </w:r>
-      <w:proofErr w:type="spellEnd"/>
-      <w:r>
-        <w:t xml:space="preserve"> Center </w:t>
-      </w:r>
-      <w:proofErr w:type="spellStart"/>
-      <w:r>
-        <w:t>for</w:t>
-      </w:r>
-      <w:proofErr w:type="spellEnd"/>
-      <w:r>
-        <w:t xml:space="preserve"> </w:t>
-      </w:r>
-      <w:proofErr w:type="spellStart"/>
-      <w:r>
-        <w:t>Biotechnology</w:t>
-      </w:r>
-      <w:proofErr w:type="spellEnd"/>
-      <w:r>
-        <w:t xml:space="preserve"> </w:t>
-      </w:r>
-      <w:proofErr w:type="spellStart"/>
-      <w:r>
-        <w:t>Information</w:t>
-      </w:r>
-      <w:proofErr w:type="spellEnd"/>
-      <w:r>
-        <w:t xml:space="preserve"> (NCBI). Para localizar los estudios de RNA-</w:t>
-      </w:r>
-      <w:proofErr w:type="spellStart"/>
-      <w:r>
-        <w:t>seq</w:t>
-      </w:r>
-      <w:proofErr w:type="spellEnd"/>
-      <w:r>
-        <w:t xml:space="preserve"> que cumplen los criterios especificados</w:t>
-      </w:r>
-      <w:r>
-        <w:t xml:space="preserve">, se aplicó el filtro de búsqueda </w:t>
-      </w:r>
-      <w:r>
-        <w:t xml:space="preserve">«(colon </w:t>
-      </w:r>
-      <w:proofErr w:type="spellStart"/>
-      <w:proofErr w:type="gramStart"/>
-      <w:r>
-        <w:t>cancer</w:t>
-      </w:r>
-      <w:proofErr w:type="spellEnd"/>
-      <w:r>
-        <w:t>[</w:t>
-      </w:r>
-      <w:proofErr w:type="gramEnd"/>
-      <w:r>
-        <w:t xml:space="preserve">Title] OR </w:t>
-      </w:r>
-      <w:proofErr w:type="spellStart"/>
-      <w:r>
-        <w:t>colorectal</w:t>
-      </w:r>
-      <w:proofErr w:type="spellEnd"/>
-      <w:r>
-        <w:t xml:space="preserve"> </w:t>
-      </w:r>
-      <w:proofErr w:type="spellStart"/>
-      <w:proofErr w:type="gramStart"/>
-      <w:r>
-        <w:t>cancer</w:t>
-      </w:r>
-      <w:proofErr w:type="spellEnd"/>
-      <w:r>
-        <w:t>[</w:t>
-      </w:r>
-      <w:proofErr w:type="gramEnd"/>
-      <w:r>
-        <w:t>Title]) AND "Homo sapiens"[</w:t>
-      </w:r>
-      <w:proofErr w:type="spellStart"/>
-      <w:r>
-        <w:t>Organism</w:t>
-      </w:r>
-      <w:proofErr w:type="spellEnd"/>
-      <w:r>
-        <w:t>] AND "</w:t>
-      </w:r>
-      <w:proofErr w:type="spellStart"/>
-      <w:r>
-        <w:t>Expression</w:t>
-      </w:r>
-      <w:proofErr w:type="spellEnd"/>
-      <w:r>
-        <w:t xml:space="preserve"> </w:t>
-      </w:r>
-      <w:proofErr w:type="spellStart"/>
-      <w:r>
-        <w:t>profiling</w:t>
-      </w:r>
-      <w:proofErr w:type="spellEnd"/>
-      <w:r>
-        <w:t xml:space="preserve"> </w:t>
-      </w:r>
-      <w:proofErr w:type="spellStart"/>
-      <w:r>
-        <w:t>by</w:t>
-      </w:r>
-      <w:proofErr w:type="spellEnd"/>
-      <w:r>
-        <w:t xml:space="preserve"> </w:t>
-      </w:r>
-      <w:proofErr w:type="spellStart"/>
-      <w:r>
-        <w:t>high</w:t>
-      </w:r>
-      <w:proofErr w:type="spellEnd"/>
-      <w:r>
-        <w:t xml:space="preserve"> </w:t>
-      </w:r>
-      <w:proofErr w:type="spellStart"/>
-      <w:r>
-        <w:t>throughput</w:t>
-      </w:r>
-      <w:proofErr w:type="spellEnd"/>
-      <w:r>
-        <w:t xml:space="preserve"> </w:t>
-      </w:r>
-      <w:proofErr w:type="spellStart"/>
-      <w:r>
-        <w:t>sequencing</w:t>
-      </w:r>
-      <w:proofErr w:type="spellEnd"/>
-      <w:r>
-        <w:t>"[</w:t>
-      </w:r>
-      <w:proofErr w:type="spellStart"/>
-      <w:r>
-        <w:t>All</w:t>
-      </w:r>
-      <w:proofErr w:type="spellEnd"/>
-      <w:r>
-        <w:t xml:space="preserve"> Fields]»</w:t>
-      </w:r>
-      <w:r>
-        <w:t xml:space="preserve"> en el motor de consulta de GEO </w:t>
-      </w:r>
-      <w:proofErr w:type="spellStart"/>
-      <w:r>
-        <w:t>DataSets</w:t>
-      </w:r>
-      <w:proofErr w:type="spellEnd"/>
-      <w:r>
-        <w:t>.</w:t>
-      </w:r>
-    </w:p>
-    <w:p>
-      <w:r>
-        <w:lastRenderedPageBreak/>
-        <w:t xml:space="preserve">A excepción del </w:t>
-      </w:r>
-      <w:proofErr w:type="spellStart"/>
-      <w:r>
-        <w:t>dataset</w:t>
-      </w:r>
-      <w:proofErr w:type="spellEnd"/>
-      <w:r>
-        <w:t xml:space="preserve"> </w:t>
-      </w:r>
-      <w:r>
-        <w:t>GSE164541</w:t>
-      </w:r>
-      <w:r>
-        <w:t>, que proporciona la matriz de conteos crudos en formato .</w:t>
-      </w:r>
-      <w:proofErr w:type="spellStart"/>
-      <w:r>
-        <w:t>csv</w:t>
-      </w:r>
-      <w:proofErr w:type="spellEnd"/>
-      <w:r>
-        <w:t>, todos los restantes</w:t>
-      </w:r>
-      <w:r>
-        <w:t xml:space="preserve"> (</w:t>
-      </w:r>
-      <w:r>
-        <w:t>GSE50760</w:t>
-      </w:r>
-      <w:r>
-        <w:t xml:space="preserve">, </w:t>
-      </w:r>
-      <w:r>
-        <w:t>GSE92914</w:t>
-      </w:r>
-      <w:r>
-        <w:t xml:space="preserve">, </w:t>
-      </w:r>
-      <w:r>
-        <w:t>GSE104836</w:t>
-      </w:r>
-      <w:r>
-        <w:t xml:space="preserve">, </w:t>
-      </w:r>
-      <w:r>
-        <w:t>GSE142279</w:t>
-      </w:r>
-      <w:r>
-        <w:t xml:space="preserve"> y </w:t>
-      </w:r>
-      <w:r>
-        <w:t>GSE156451</w:t>
-      </w:r>
-      <w:r>
-        <w:t>)</w:t>
-      </w:r>
-      <w:r>
-        <w:t xml:space="preserve"> corresponden con </w:t>
-      </w:r>
-      <w:r>
-        <w:t xml:space="preserve">matrices de conteo preprocesadas de forma estandarizada por el </w:t>
+        <w:t>Sequence Read Archive</w:t>
+      </w:r>
+      <w:r>
+        <w:t xml:space="preserve"> (SRA) clasificadas como transcriptómicas y correspondientes a </w:t>
       </w:r>
       <w:r>
         <w:rPr>
           <w:i/>
           <w:iCs/>
         </w:rPr>
-        <w:t>pipeline</w:t>
-      </w:r>
-      <w:r>
-        <w:t xml:space="preserve"> del NCBI</w:t>
-      </w:r>
-      <w:r>
-        <w:t>.</w:t>
-      </w:r>
-      <w:r>
-        <w:t xml:space="preserve"> Este consiste en el alineamiento de </w:t>
-      </w:r>
-      <w:r>
-        <w:t xml:space="preserve">las ejecuciones de secuenciación del </w:t>
-      </w:r>
-      <w:proofErr w:type="spellStart"/>
+        <w:t>Homo sapiens</w:t>
+      </w:r>
+      <w:r>
+        <w:t xml:space="preserve"> contra el ensamblaje del genoma de referencia GCA_000001405.15 utilizando el algoritmo HISAT2. Aquellas ejecuciones que logran superar una tasa de alineamiento mínima del 50% son procesadas a continuación con el programa </w:t>
+      </w:r>
       <w:r>
         <w:rPr>
           <w:i/>
           <w:iCs/>
         </w:rPr>
-        <w:t>Sequence</w:t>
-      </w:r>
-      <w:proofErr w:type="spellEnd"/>
+        <w:t>featureCounts</w:t>
+      </w:r>
+      <w:r>
+        <w:t xml:space="preserve"> (paquete Subread), el cual genera un archivo de conteo crudo individual para cada ejecución. Posteriormente, GEO integra estos archivos individuales en matrices de conteo crudo a nivel de Serie (</w:t>
+      </w:r>
       <w:r>
         <w:rPr>
           <w:i/>
           <w:iCs/>
         </w:rPr>
-        <w:t xml:space="preserve"> Read Archive</w:t>
-      </w:r>
-      <w:r>
-        <w:t xml:space="preserve"> (SRA) clasificadas como transcriptómicas y correspondientes a </w:t>
+        <w:t>GEO Series raw counts matrices</w:t>
+      </w:r>
+      <w:r>
+        <w:t xml:space="preserve">). Como paso final </w:t>
+      </w:r>
+      <w:r>
+        <w:t xml:space="preserve">de este </w:t>
       </w:r>
       <w:r>
         <w:rPr>
           <w:i/>
           <w:iCs/>
         </w:rPr>
-        <w:t>Homo sapiens</w:t>
-      </w:r>
-      <w:r>
-        <w:t xml:space="preserve"> contra el ensamblaje del genoma de referencia GCA_000001405.15 utilizando el algoritmo HISAT2. Aquellas ejecuciones que logran superar una tasa de alineamiento mínima del 50% son procesadas a continuación con el programa </w:t>
-      </w:r>
-      <w:proofErr w:type="spellStart"/>
+        <w:t>pipeline</w:t>
+      </w:r>
+      <w:r>
+        <w:t xml:space="preserve">, los valores cuantitativos de las matrices se redondean para asegurar que sean </w:t>
+      </w:r>
       <w:r>
         <w:rPr>
           <w:i/>
           <w:iCs/>
         </w:rPr>
-        <w:t>featureCounts</w:t>
-      </w:r>
-      <w:proofErr w:type="spellEnd"/>
-      <w:r>
-        <w:t xml:space="preserve"> (paquete </w:t>
-      </w:r>
-      <w:proofErr w:type="spellStart"/>
-      <w:r>
-        <w:t>Subread</w:t>
-      </w:r>
-      <w:proofErr w:type="spellEnd"/>
-      <w:r>
-        <w:t>), el cual genera un archivo de conteo crudo individual para cada ejecución. Posteriormente, GEO integra estos archivos individuales en matrices de conteo crudo a nivel de Serie (</w:t>
+        <w:t>inputs</w:t>
+      </w:r>
+      <w:r>
+        <w:t xml:space="preserve"> compatibles con los programas estándar de análisis de expresión diferencial.</w:t>
+      </w:r>
+    </w:p>
+    <w:p>
+      <w:r>
+        <w:t xml:space="preserve">A pesar de que la generación de datos automatizada por el NCBI supone una herramienta valiosa, este procedimiento conlleva limitaciones relacionadas con los umbrales de calidad, la consistencia con las publicaciones originales o la </w:t>
+      </w:r>
+      <w:r>
+        <w:t>ausencia e incompatibilidad interna de las muestras</w:t>
+      </w:r>
+      <w:r>
+        <w:t xml:space="preserve">. No obstante, </w:t>
+      </w:r>
+      <w:r>
+        <w:t xml:space="preserve">se </w:t>
+      </w:r>
+      <w:r>
+        <w:t>opta por</w:t>
+      </w:r>
+      <w:r>
+        <w:t xml:space="preserve"> el uso de estos conjuntos de datos como una decisión estratégica que permite mitigar la carencia de recursos de computación de alto rendimiento</w:t>
+      </w:r>
+      <w:r>
+        <w:rPr>
+          <w:b/>
+          <w:bCs/>
+        </w:rPr>
+        <w:t xml:space="preserve"> </w:t>
+      </w:r>
+      <w:r>
+        <w:t>necesarios para el procesamiento de lecturas primarias.</w:t>
+      </w:r>
+    </w:p>
+    <w:p>
+      <w:r>
+        <w:t xml:space="preserve">Finalmente, se ha obtenido la información clínica a partir de </w:t>
+      </w:r>
+      <w:r>
+        <w:t>la plataforma GREIN (</w:t>
       </w:r>
       <w:r>
         <w:rPr>
           <w:i/>
           <w:iCs/>
         </w:rPr>
-        <w:t xml:space="preserve">GEO Series raw </w:t>
-      </w:r>
-      <w:proofErr w:type="spellStart"/>
+        <w:t>GReat Expression INterface</w:t>
+      </w:r>
+      <w:r>
+        <w:t xml:space="preserve">), </w:t>
+      </w:r>
+      <w:r>
+        <w:t>puesto que</w:t>
+      </w:r>
+      <w:r>
+        <w:t xml:space="preserve"> permite la descarga de los metadatos en formato .csv. Esta elección técnica facilita la interoperabilidad con el entorno R y agiliza la estructuración de los objetos de datos necesarios. Como medida de control de calidad, la información obtenida se contrasta sistemáticamente con los archivos </w:t>
+      </w:r>
       <w:r>
         <w:rPr>
           <w:i/>
           <w:iCs/>
         </w:rPr>
-        <w:t>counts</w:t>
-      </w:r>
-      <w:proofErr w:type="spellEnd"/>
-      <w:r>
-        <w:rPr>
-          <w:i/>
-          <w:iCs/>
-        </w:rPr>
-        <w:t xml:space="preserve"> matrices</w:t>
-      </w:r>
-      <w:r>
-        <w:t xml:space="preserve">). Como paso final </w:t>
-      </w:r>
-      <w:r>
-        <w:t xml:space="preserve">de este </w:t>
-      </w:r>
-      <w:r>
-        <w:rPr>
-          <w:i/>
-          <w:iCs/>
-        </w:rPr>
-        <w:t>pipeline</w:t>
-      </w:r>
-      <w:r>
-        <w:t xml:space="preserve">, los valores cuantitativos de las matrices se redondean para asegurar que sean </w:t>
-      </w:r>
-      <w:r>
-        <w:rPr>
-          <w:i/>
-          <w:iCs/>
-        </w:rPr>
-        <w:t>inputs</w:t>
-      </w:r>
-      <w:r>
-        <w:t xml:space="preserve"> compatibles con los programas estándar de análisis de expresión diferencial.</w:t>
-      </w:r>
-    </w:p>
-    <w:p>
-      <w:r>
-        <w:t xml:space="preserve">A pesar de que la generación de datos automatizada por el NCBI supone una herramienta valiosa, este procedimiento conlleva limitaciones relacionadas con los umbrales de calidad, la consistencia con las publicaciones originales o la </w:t>
-      </w:r>
-      <w:r>
-        <w:t>ausencia e incompatibilidad interna de las muestras</w:t>
-      </w:r>
-      <w:r>
-        <w:t xml:space="preserve">. No obstante, </w:t>
-      </w:r>
-      <w:r>
-        <w:t xml:space="preserve">se </w:t>
-      </w:r>
-      <w:r>
-        <w:t>opta por</w:t>
-      </w:r>
-      <w:r>
-        <w:t xml:space="preserve"> el uso de estos conjuntos de datos como una decisión estratégica que permite mitigar la carencia de recursos de computación de alto rendimiento</w:t>
-      </w:r>
-      <w:r>
-        <w:rPr>
-          <w:b/>
-          <w:bCs/>
-        </w:rPr>
-        <w:t xml:space="preserve"> </w:t>
-      </w:r>
-      <w:r>
-        <w:t>necesarios para el procesamiento de lecturas primarias.</w:t>
-      </w:r>
-    </w:p>
-    <w:p>
-      <w:r>
-        <w:t xml:space="preserve">Finalmente, se ha obtenido la información clínica a partir de </w:t>
-      </w:r>
-      <w:r>
-        <w:t>la plataforma GREIN (</w:t>
-      </w:r>
-      <w:proofErr w:type="spellStart"/>
-      <w:r>
-        <w:rPr>
-          <w:i/>
-          <w:iCs/>
-        </w:rPr>
-        <w:t>GReat</w:t>
-      </w:r>
-      <w:proofErr w:type="spellEnd"/>
-      <w:r>
-        <w:rPr>
-          <w:i/>
-          <w:iCs/>
-        </w:rPr>
-        <w:t xml:space="preserve"> </w:t>
-      </w:r>
-      <w:proofErr w:type="spellStart"/>
-      <w:r>
-        <w:rPr>
-          <w:i/>
-          <w:iCs/>
-        </w:rPr>
-        <w:t>Expression</w:t>
-      </w:r>
-      <w:proofErr w:type="spellEnd"/>
-      <w:r>
-        <w:rPr>
-          <w:i/>
-          <w:iCs/>
-        </w:rPr>
-        <w:t xml:space="preserve"> </w:t>
-      </w:r>
-      <w:proofErr w:type="spellStart"/>
-      <w:proofErr w:type="gramStart"/>
-      <w:r>
-        <w:rPr>
-          <w:i/>
-          <w:iCs/>
-        </w:rPr>
-        <w:t>INterface</w:t>
-      </w:r>
-      <w:proofErr w:type="spellEnd"/>
-      <w:proofErr w:type="gramEnd"/>
-      <w:r>
-        <w:t xml:space="preserve">), </w:t>
-      </w:r>
-      <w:r>
-        <w:t>puesto que</w:t>
-      </w:r>
-      <w:r>
-        <w:t xml:space="preserve"> permite la descarga de los metadatos en formato .</w:t>
-      </w:r>
-      <w:proofErr w:type="spellStart"/>
-      <w:r>
-        <w:t>csv</w:t>
-      </w:r>
-      <w:proofErr w:type="spellEnd"/>
-      <w:r>
-        <w:t xml:space="preserve">. Esta elección técnica facilita la interoperabilidad con el entorno R y agiliza la estructuración de los objetos de datos necesarios. Como medida de control de calidad, la información obtenida se contrasta sistemáticamente con los archivos </w:t>
-      </w:r>
-      <w:r>
-        <w:rPr>
-          <w:i/>
-          <w:iCs/>
-        </w:rPr>
         <w:t>Series Matrix</w:t>
       </w:r>
       <w:r>
@@ -5745,34 +5482,12 @@
         <w:pStyle w:val="Ttulo4"/>
       </w:pPr>
       <w:r>
-        <w:t xml:space="preserve">The Cancer </w:t>
-      </w:r>
-      <w:proofErr w:type="spellStart"/>
-      <w:r>
-        <w:t>Genomic</w:t>
-      </w:r>
-      <w:proofErr w:type="spellEnd"/>
-      <w:r>
-        <w:t xml:space="preserve"> Atlas (TCGA)</w:t>
-      </w:r>
-    </w:p>
-    <w:p>
-      <w:r>
-        <w:t xml:space="preserve">Repositorio utilizado </w:t>
-      </w:r>
-      <w:r>
-        <w:t>NCBI GEO</w:t>
-      </w:r>
-    </w:p>
-    <w:p>
-      <w:r>
-        <w:t xml:space="preserve">Repositorio utilizado </w:t>
-      </w:r>
-      <w:r>
-        <w:t>TCGA-GDC</w:t>
-      </w:r>
-      <w:r>
-        <w:t xml:space="preserve"> a partir de script</w:t>
+        <w:t>The Cancer Genomic Atlas (TCGA)</w:t>
+      </w:r>
+    </w:p>
+    <w:p>
+      <w:r>
+        <w:t>Todavia no tengo muy claro para que voy a emplear este dataset</w:t>
       </w:r>
     </w:p>
     <w:p/>
@@ -5782,9 +5497,1340 @@
       <w:pPr>
         <w:pStyle w:val="Ttulo3"/>
       </w:pPr>
-      <w:r>
+      <w:bookmarkStart w:id="29" w:name="_Toc228992848"/>
+      <w:r>
+        <w:lastRenderedPageBreak/>
         <w:t>Descripción de la cohorte</w:t>
       </w:r>
+      <w:bookmarkEnd w:id="29"/>
+    </w:p>
+    <w:p>
+      <w:r>
+        <w:t>Explicar aquí las características globales de las cohortes seleccionadas, detallando el cómputo total de muestras analizadas.</w:t>
+      </w:r>
+    </w:p>
+    <w:p>
+      <w:r>
+        <w:t>blablabla</w:t>
+      </w:r>
+    </w:p>
+    <w:p>
+      <w:pPr>
+        <w:pStyle w:val="TtuloTDC"/>
+        <w:spacing w:after="0"/>
+      </w:pPr>
+      <w:bookmarkStart w:id="30" w:name="_Toc228992878"/>
+      <w:r>
+        <w:t>Tabla 1. Resumen de los datasets de RNA-seq integrados y características del diseño experimental.</w:t>
+      </w:r>
+      <w:bookmarkEnd w:id="30"/>
+    </w:p>
+    <w:tbl>
+      <w:tblPr>
+        <w:tblStyle w:val="Tablaconcuadrcula7concolores"/>
+        <w:tblW w:w="0" w:type="auto"/>
+        <w:tblInd w:w="-5" w:type="dxa"/>
+        <w:tblLook w:val="04A0" w:firstRow="1" w:lastRow="0" w:firstColumn="1" w:lastColumn="0" w:noHBand="0" w:noVBand="1"/>
+      </w:tblPr>
+      <w:tblGrid>
+        <w:gridCol w:w="1330"/>
+        <w:gridCol w:w="1147"/>
+        <w:gridCol w:w="1408"/>
+        <w:gridCol w:w="1103"/>
+        <w:gridCol w:w="1727"/>
+        <w:gridCol w:w="1105"/>
+        <w:gridCol w:w="1256"/>
+      </w:tblGrid>
+      <w:tr>
+        <w:trPr>
+          <w:cnfStyle w:val="100000000000" w:firstRow="1" w:lastRow="0" w:firstColumn="0" w:lastColumn="0" w:oddVBand="0" w:evenVBand="0" w:oddHBand="0" w:evenHBand="0" w:firstRowFirstColumn="0" w:firstRowLastColumn="0" w:lastRowFirstColumn="0" w:lastRowLastColumn="0"/>
+        </w:trPr>
+        <w:tc>
+          <w:tcPr>
+            <w:cnfStyle w:val="001000000100" w:firstRow="0" w:lastRow="0" w:firstColumn="1" w:lastColumn="0" w:oddVBand="0" w:evenVBand="0" w:oddHBand="0" w:evenHBand="0" w:firstRowFirstColumn="1" w:firstRowLastColumn="0" w:lastRowFirstColumn="0" w:lastRowLastColumn="0"/>
+            <w:tcW w:w="0" w:type="auto"/>
+            <w:vAlign w:val="center"/>
+          </w:tcPr>
+          <w:p>
+            <w:pPr>
+              <w:spacing w:before="0"/>
+              <w:jc w:val="center"/>
+              <w:rPr>
+                <w:rFonts w:cstheme="minorHAnsi"/>
+                <w:i w:val="0"/>
+                <w:iCs w:val="0"/>
+                <w:color w:val="auto"/>
+              </w:rPr>
+            </w:pPr>
+            <w:r>
+              <w:rPr>
+                <w:rFonts w:cstheme="minorHAnsi"/>
+                <w:b w:val="0"/>
+                <w:bCs w:val="0"/>
+                <w:i w:val="0"/>
+                <w:iCs w:val="0"/>
+                <w:color w:val="auto"/>
+              </w:rPr>
+              <w:t>ID Dataset</w:t>
+            </w:r>
+          </w:p>
+        </w:tc>
+        <w:tc>
+          <w:tcPr>
+            <w:tcW w:w="0" w:type="auto"/>
+            <w:vAlign w:val="center"/>
+          </w:tcPr>
+          <w:p>
+            <w:pPr>
+              <w:spacing w:before="0"/>
+              <w:jc w:val="center"/>
+              <w:cnfStyle w:val="100000000000" w:firstRow="1" w:lastRow="0" w:firstColumn="0" w:lastColumn="0" w:oddVBand="0" w:evenVBand="0" w:oddHBand="0" w:evenHBand="0" w:firstRowFirstColumn="0" w:firstRowLastColumn="0" w:lastRowFirstColumn="0" w:lastRowLastColumn="0"/>
+              <w:rPr>
+                <w:rFonts w:cstheme="minorHAnsi"/>
+                <w:color w:val="auto"/>
+              </w:rPr>
+            </w:pPr>
+            <w:r>
+              <w:rPr>
+                <w:rFonts w:cstheme="minorHAnsi"/>
+                <w:b w:val="0"/>
+                <w:bCs w:val="0"/>
+                <w:color w:val="auto"/>
+              </w:rPr>
+              <w:t>N (Original)</w:t>
+            </w:r>
+          </w:p>
+        </w:tc>
+        <w:tc>
+          <w:tcPr>
+            <w:tcW w:w="0" w:type="auto"/>
+            <w:vAlign w:val="center"/>
+          </w:tcPr>
+          <w:p>
+            <w:pPr>
+              <w:spacing w:before="0"/>
+              <w:jc w:val="center"/>
+              <w:cnfStyle w:val="100000000000" w:firstRow="1" w:lastRow="0" w:firstColumn="0" w:lastColumn="0" w:oddVBand="0" w:evenVBand="0" w:oddHBand="0" w:evenHBand="0" w:firstRowFirstColumn="0" w:firstRowLastColumn="0" w:lastRowFirstColumn="0" w:lastRowLastColumn="0"/>
+              <w:rPr>
+                <w:rFonts w:cstheme="minorHAnsi"/>
+                <w:color w:val="auto"/>
+              </w:rPr>
+            </w:pPr>
+            <w:r>
+              <w:rPr>
+                <w:rFonts w:cstheme="minorHAnsi"/>
+                <w:b w:val="0"/>
+                <w:bCs w:val="0"/>
+                <w:color w:val="auto"/>
+              </w:rPr>
+              <w:t>Tejido Normal Adyacente</w:t>
+            </w:r>
+          </w:p>
+        </w:tc>
+        <w:tc>
+          <w:tcPr>
+            <w:tcW w:w="0" w:type="auto"/>
+            <w:vAlign w:val="center"/>
+          </w:tcPr>
+          <w:p>
+            <w:pPr>
+              <w:spacing w:before="0"/>
+              <w:jc w:val="center"/>
+              <w:cnfStyle w:val="100000000000" w:firstRow="1" w:lastRow="0" w:firstColumn="0" w:lastColumn="0" w:oddVBand="0" w:evenVBand="0" w:oddHBand="0" w:evenHBand="0" w:firstRowFirstColumn="0" w:firstRowLastColumn="0" w:lastRowFirstColumn="0" w:lastRowLastColumn="0"/>
+              <w:rPr>
+                <w:rFonts w:cstheme="minorHAnsi"/>
+                <w:color w:val="auto"/>
+              </w:rPr>
+            </w:pPr>
+            <w:r>
+              <w:rPr>
+                <w:rFonts w:cstheme="minorHAnsi"/>
+                <w:b w:val="0"/>
+                <w:bCs w:val="0"/>
+                <w:color w:val="auto"/>
+              </w:rPr>
+              <w:t>Tejido Tumoral</w:t>
+            </w:r>
+          </w:p>
+        </w:tc>
+        <w:tc>
+          <w:tcPr>
+            <w:tcW w:w="0" w:type="auto"/>
+            <w:vAlign w:val="center"/>
+          </w:tcPr>
+          <w:p>
+            <w:pPr>
+              <w:spacing w:before="0"/>
+              <w:jc w:val="center"/>
+              <w:cnfStyle w:val="100000000000" w:firstRow="1" w:lastRow="0" w:firstColumn="0" w:lastColumn="0" w:oddVBand="0" w:evenVBand="0" w:oddHBand="0" w:evenHBand="0" w:firstRowFirstColumn="0" w:firstRowLastColumn="0" w:lastRowFirstColumn="0" w:lastRowLastColumn="0"/>
+              <w:rPr>
+                <w:rFonts w:cstheme="minorHAnsi"/>
+                <w:color w:val="auto"/>
+              </w:rPr>
+            </w:pPr>
+            <w:r>
+              <w:rPr>
+                <w:rFonts w:cstheme="minorHAnsi"/>
+                <w:b w:val="0"/>
+                <w:bCs w:val="0"/>
+                <w:color w:val="auto"/>
+              </w:rPr>
+              <w:t>Muestras excluidas (Motivo)</w:t>
+            </w:r>
+          </w:p>
+        </w:tc>
+        <w:tc>
+          <w:tcPr>
+            <w:tcW w:w="0" w:type="auto"/>
+            <w:vAlign w:val="center"/>
+          </w:tcPr>
+          <w:p>
+            <w:pPr>
+              <w:spacing w:before="0"/>
+              <w:jc w:val="center"/>
+              <w:cnfStyle w:val="100000000000" w:firstRow="1" w:lastRow="0" w:firstColumn="0" w:lastColumn="0" w:oddVBand="0" w:evenVBand="0" w:oddHBand="0" w:evenHBand="0" w:firstRowFirstColumn="0" w:firstRowLastColumn="0" w:lastRowFirstColumn="0" w:lastRowLastColumn="0"/>
+              <w:rPr>
+                <w:rFonts w:cstheme="minorHAnsi"/>
+                <w:color w:val="auto"/>
+              </w:rPr>
+            </w:pPr>
+            <w:r>
+              <w:rPr>
+                <w:rFonts w:cstheme="minorHAnsi"/>
+                <w:b w:val="0"/>
+                <w:bCs w:val="0"/>
+                <w:color w:val="auto"/>
+              </w:rPr>
+              <w:t>Diseño Pareado</w:t>
+            </w:r>
+          </w:p>
+        </w:tc>
+        <w:tc>
+          <w:tcPr>
+            <w:tcW w:w="0" w:type="auto"/>
+            <w:vAlign w:val="center"/>
+          </w:tcPr>
+          <w:p>
+            <w:pPr>
+              <w:spacing w:before="0"/>
+              <w:jc w:val="center"/>
+              <w:cnfStyle w:val="100000000000" w:firstRow="1" w:lastRow="0" w:firstColumn="0" w:lastColumn="0" w:oddVBand="0" w:evenVBand="0" w:oddHBand="0" w:evenHBand="0" w:firstRowFirstColumn="0" w:firstRowLastColumn="0" w:lastRowFirstColumn="0" w:lastRowLastColumn="0"/>
+              <w:rPr>
+                <w:rFonts w:cstheme="minorHAnsi"/>
+                <w:color w:val="auto"/>
+              </w:rPr>
+            </w:pPr>
+            <w:r>
+              <w:rPr>
+                <w:rFonts w:cstheme="minorHAnsi"/>
+                <w:b w:val="0"/>
+                <w:bCs w:val="0"/>
+                <w:color w:val="auto"/>
+              </w:rPr>
+              <w:t>Versión del Genoma</w:t>
+            </w:r>
+          </w:p>
+        </w:tc>
+      </w:tr>
+      <w:tr>
+        <w:trPr>
+          <w:cnfStyle w:val="000000100000" w:firstRow="0" w:lastRow="0" w:firstColumn="0" w:lastColumn="0" w:oddVBand="0" w:evenVBand="0" w:oddHBand="1" w:evenHBand="0" w:firstRowFirstColumn="0" w:firstRowLastColumn="0" w:lastRowFirstColumn="0" w:lastRowLastColumn="0"/>
+        </w:trPr>
+        <w:tc>
+          <w:tcPr>
+            <w:cnfStyle w:val="001000000000" w:firstRow="0" w:lastRow="0" w:firstColumn="1" w:lastColumn="0" w:oddVBand="0" w:evenVBand="0" w:oddHBand="0" w:evenHBand="0" w:firstRowFirstColumn="0" w:firstRowLastColumn="0" w:lastRowFirstColumn="0" w:lastRowLastColumn="0"/>
+            <w:tcW w:w="0" w:type="auto"/>
+            <w:vAlign w:val="center"/>
+          </w:tcPr>
+          <w:p>
+            <w:pPr>
+              <w:jc w:val="center"/>
+              <w:rPr>
+                <w:rFonts w:cstheme="minorHAnsi"/>
+              </w:rPr>
+            </w:pPr>
+            <w:r>
+              <w:rPr>
+                <w:rFonts w:cstheme="minorHAnsi"/>
+                <w:color w:val="000000"/>
+              </w:rPr>
+              <w:t>GSE50760</w:t>
+            </w:r>
+          </w:p>
+        </w:tc>
+        <w:tc>
+          <w:tcPr>
+            <w:tcW w:w="0" w:type="auto"/>
+            <w:vAlign w:val="center"/>
+          </w:tcPr>
+          <w:p>
+            <w:pPr>
+              <w:jc w:val="center"/>
+              <w:cnfStyle w:val="000000100000" w:firstRow="0" w:lastRow="0" w:firstColumn="0" w:lastColumn="0" w:oddVBand="0" w:evenVBand="0" w:oddHBand="1" w:evenHBand="0" w:firstRowFirstColumn="0" w:firstRowLastColumn="0" w:lastRowFirstColumn="0" w:lastRowLastColumn="0"/>
+              <w:rPr>
+                <w:rFonts w:cstheme="minorHAnsi"/>
+              </w:rPr>
+            </w:pPr>
+            <w:r>
+              <w:rPr>
+                <w:rFonts w:cstheme="minorHAnsi"/>
+                <w:color w:val="000000"/>
+              </w:rPr>
+              <w:t>54</w:t>
+            </w:r>
+          </w:p>
+        </w:tc>
+        <w:tc>
+          <w:tcPr>
+            <w:tcW w:w="0" w:type="auto"/>
+            <w:vAlign w:val="center"/>
+          </w:tcPr>
+          <w:p>
+            <w:pPr>
+              <w:jc w:val="center"/>
+              <w:cnfStyle w:val="000000100000" w:firstRow="0" w:lastRow="0" w:firstColumn="0" w:lastColumn="0" w:oddVBand="0" w:evenVBand="0" w:oddHBand="1" w:evenHBand="0" w:firstRowFirstColumn="0" w:firstRowLastColumn="0" w:lastRowFirstColumn="0" w:lastRowLastColumn="0"/>
+              <w:rPr>
+                <w:rFonts w:cstheme="minorHAnsi"/>
+              </w:rPr>
+            </w:pPr>
+            <w:r>
+              <w:rPr>
+                <w:rFonts w:cstheme="minorHAnsi"/>
+                <w:color w:val="000000"/>
+              </w:rPr>
+              <w:t>18</w:t>
+            </w:r>
+          </w:p>
+        </w:tc>
+        <w:tc>
+          <w:tcPr>
+            <w:tcW w:w="0" w:type="auto"/>
+            <w:vAlign w:val="center"/>
+          </w:tcPr>
+          <w:p>
+            <w:pPr>
+              <w:jc w:val="center"/>
+              <w:cnfStyle w:val="000000100000" w:firstRow="0" w:lastRow="0" w:firstColumn="0" w:lastColumn="0" w:oddVBand="0" w:evenVBand="0" w:oddHBand="1" w:evenHBand="0" w:firstRowFirstColumn="0" w:firstRowLastColumn="0" w:lastRowFirstColumn="0" w:lastRowLastColumn="0"/>
+              <w:rPr>
+                <w:rFonts w:cstheme="minorHAnsi"/>
+              </w:rPr>
+            </w:pPr>
+            <w:r>
+              <w:rPr>
+                <w:rFonts w:cstheme="minorHAnsi"/>
+                <w:color w:val="000000"/>
+              </w:rPr>
+              <w:t>18</w:t>
+            </w:r>
+          </w:p>
+        </w:tc>
+        <w:tc>
+          <w:tcPr>
+            <w:tcW w:w="0" w:type="auto"/>
+            <w:vAlign w:val="center"/>
+          </w:tcPr>
+          <w:p>
+            <w:pPr>
+              <w:jc w:val="center"/>
+              <w:cnfStyle w:val="000000100000" w:firstRow="0" w:lastRow="0" w:firstColumn="0" w:lastColumn="0" w:oddVBand="0" w:evenVBand="0" w:oddHBand="1" w:evenHBand="0" w:firstRowFirstColumn="0" w:firstRowLastColumn="0" w:lastRowFirstColumn="0" w:lastRowLastColumn="0"/>
+              <w:rPr>
+                <w:rFonts w:cstheme="minorHAnsi"/>
+              </w:rPr>
+            </w:pPr>
+            <w:r>
+              <w:rPr>
+                <w:rFonts w:cstheme="minorHAnsi"/>
+                <w:color w:val="000000"/>
+              </w:rPr>
+              <w:t>18 (Metástasis hepática)</w:t>
+            </w:r>
+          </w:p>
+        </w:tc>
+        <w:tc>
+          <w:tcPr>
+            <w:tcW w:w="0" w:type="auto"/>
+            <w:vAlign w:val="center"/>
+          </w:tcPr>
+          <w:p>
+            <w:pPr>
+              <w:jc w:val="center"/>
+              <w:cnfStyle w:val="000000100000" w:firstRow="0" w:lastRow="0" w:firstColumn="0" w:lastColumn="0" w:oddVBand="0" w:evenVBand="0" w:oddHBand="1" w:evenHBand="0" w:firstRowFirstColumn="0" w:firstRowLastColumn="0" w:lastRowFirstColumn="0" w:lastRowLastColumn="0"/>
+              <w:rPr>
+                <w:rFonts w:cstheme="minorHAnsi"/>
+              </w:rPr>
+            </w:pPr>
+            <w:r>
+              <w:rPr>
+                <w:rFonts w:cstheme="minorHAnsi"/>
+                <w:color w:val="000000"/>
+              </w:rPr>
+              <w:t>Sí</w:t>
+            </w:r>
+          </w:p>
+        </w:tc>
+        <w:tc>
+          <w:tcPr>
+            <w:tcW w:w="0" w:type="auto"/>
+            <w:vAlign w:val="center"/>
+          </w:tcPr>
+          <w:p>
+            <w:pPr>
+              <w:jc w:val="center"/>
+              <w:cnfStyle w:val="000000100000" w:firstRow="0" w:lastRow="0" w:firstColumn="0" w:lastColumn="0" w:oddVBand="0" w:evenVBand="0" w:oddHBand="1" w:evenHBand="0" w:firstRowFirstColumn="0" w:firstRowLastColumn="0" w:lastRowFirstColumn="0" w:lastRowLastColumn="0"/>
+              <w:rPr>
+                <w:rFonts w:cstheme="minorHAnsi"/>
+              </w:rPr>
+            </w:pPr>
+            <w:r>
+              <w:rPr>
+                <w:rFonts w:cstheme="minorHAnsi"/>
+                <w:color w:val="000000"/>
+              </w:rPr>
+              <w:t>hg19 (GRCh37)</w:t>
+            </w:r>
+          </w:p>
+        </w:tc>
+      </w:tr>
+      <w:tr>
+        <w:tc>
+          <w:tcPr>
+            <w:cnfStyle w:val="001000000000" w:firstRow="0" w:lastRow="0" w:firstColumn="1" w:lastColumn="0" w:oddVBand="0" w:evenVBand="0" w:oddHBand="0" w:evenHBand="0" w:firstRowFirstColumn="0" w:firstRowLastColumn="0" w:lastRowFirstColumn="0" w:lastRowLastColumn="0"/>
+            <w:tcW w:w="0" w:type="auto"/>
+            <w:vAlign w:val="center"/>
+          </w:tcPr>
+          <w:p>
+            <w:pPr>
+              <w:jc w:val="center"/>
+              <w:rPr>
+                <w:rFonts w:cstheme="minorHAnsi"/>
+              </w:rPr>
+            </w:pPr>
+            <w:r>
+              <w:rPr>
+                <w:rFonts w:cstheme="minorHAnsi"/>
+                <w:color w:val="000000"/>
+              </w:rPr>
+              <w:t>GSE92914</w:t>
+            </w:r>
+          </w:p>
+        </w:tc>
+        <w:tc>
+          <w:tcPr>
+            <w:tcW w:w="0" w:type="auto"/>
+            <w:vAlign w:val="center"/>
+          </w:tcPr>
+          <w:p>
+            <w:pPr>
+              <w:jc w:val="center"/>
+              <w:cnfStyle w:val="000000000000" w:firstRow="0" w:lastRow="0" w:firstColumn="0" w:lastColumn="0" w:oddVBand="0" w:evenVBand="0" w:oddHBand="0" w:evenHBand="0" w:firstRowFirstColumn="0" w:firstRowLastColumn="0" w:lastRowFirstColumn="0" w:lastRowLastColumn="0"/>
+              <w:rPr>
+                <w:rFonts w:cstheme="minorHAnsi"/>
+              </w:rPr>
+            </w:pPr>
+            <w:r>
+              <w:rPr>
+                <w:rFonts w:cstheme="minorHAnsi"/>
+                <w:color w:val="000000"/>
+              </w:rPr>
+              <w:t>12</w:t>
+            </w:r>
+          </w:p>
+        </w:tc>
+        <w:tc>
+          <w:tcPr>
+            <w:tcW w:w="0" w:type="auto"/>
+            <w:vAlign w:val="center"/>
+          </w:tcPr>
+          <w:p>
+            <w:pPr>
+              <w:jc w:val="center"/>
+              <w:cnfStyle w:val="000000000000" w:firstRow="0" w:lastRow="0" w:firstColumn="0" w:lastColumn="0" w:oddVBand="0" w:evenVBand="0" w:oddHBand="0" w:evenHBand="0" w:firstRowFirstColumn="0" w:firstRowLastColumn="0" w:lastRowFirstColumn="0" w:lastRowLastColumn="0"/>
+              <w:rPr>
+                <w:rFonts w:cstheme="minorHAnsi"/>
+              </w:rPr>
+            </w:pPr>
+            <w:r>
+              <w:rPr>
+                <w:rFonts w:cstheme="minorHAnsi"/>
+                <w:color w:val="000000"/>
+              </w:rPr>
+              <w:t>3</w:t>
+            </w:r>
+          </w:p>
+        </w:tc>
+        <w:tc>
+          <w:tcPr>
+            <w:tcW w:w="0" w:type="auto"/>
+            <w:vAlign w:val="center"/>
+          </w:tcPr>
+          <w:p>
+            <w:pPr>
+              <w:jc w:val="center"/>
+              <w:cnfStyle w:val="000000000000" w:firstRow="0" w:lastRow="0" w:firstColumn="0" w:lastColumn="0" w:oddVBand="0" w:evenVBand="0" w:oddHBand="0" w:evenHBand="0" w:firstRowFirstColumn="0" w:firstRowLastColumn="0" w:lastRowFirstColumn="0" w:lastRowLastColumn="0"/>
+              <w:rPr>
+                <w:rFonts w:cstheme="minorHAnsi"/>
+              </w:rPr>
+            </w:pPr>
+            <w:r>
+              <w:rPr>
+                <w:rFonts w:cstheme="minorHAnsi"/>
+                <w:color w:val="000000"/>
+              </w:rPr>
+              <w:t>3</w:t>
+            </w:r>
+          </w:p>
+        </w:tc>
+        <w:tc>
+          <w:tcPr>
+            <w:tcW w:w="0" w:type="auto"/>
+            <w:vAlign w:val="center"/>
+          </w:tcPr>
+          <w:p>
+            <w:pPr>
+              <w:jc w:val="center"/>
+              <w:cnfStyle w:val="000000000000" w:firstRow="0" w:lastRow="0" w:firstColumn="0" w:lastColumn="0" w:oddVBand="0" w:evenVBand="0" w:oddHBand="0" w:evenHBand="0" w:firstRowFirstColumn="0" w:firstRowLastColumn="0" w:lastRowFirstColumn="0" w:lastRowLastColumn="0"/>
+              <w:rPr>
+                <w:rFonts w:cstheme="minorHAnsi"/>
+              </w:rPr>
+            </w:pPr>
+            <w:r>
+              <w:rPr>
+                <w:rFonts w:cstheme="minorHAnsi"/>
+                <w:color w:val="000000"/>
+              </w:rPr>
+              <w:t>6 (Metástasis y muestras control sin metástasis)</w:t>
+            </w:r>
+          </w:p>
+        </w:tc>
+        <w:tc>
+          <w:tcPr>
+            <w:tcW w:w="0" w:type="auto"/>
+            <w:vAlign w:val="center"/>
+          </w:tcPr>
+          <w:p>
+            <w:pPr>
+              <w:jc w:val="center"/>
+              <w:cnfStyle w:val="000000000000" w:firstRow="0" w:lastRow="0" w:firstColumn="0" w:lastColumn="0" w:oddVBand="0" w:evenVBand="0" w:oddHBand="0" w:evenHBand="0" w:firstRowFirstColumn="0" w:firstRowLastColumn="0" w:lastRowFirstColumn="0" w:lastRowLastColumn="0"/>
+              <w:rPr>
+                <w:rFonts w:cstheme="minorHAnsi"/>
+              </w:rPr>
+            </w:pPr>
+            <w:r>
+              <w:rPr>
+                <w:rFonts w:cstheme="minorHAnsi"/>
+                <w:color w:val="000000"/>
+              </w:rPr>
+              <w:t>Sí</w:t>
+            </w:r>
+          </w:p>
+        </w:tc>
+        <w:tc>
+          <w:tcPr>
+            <w:tcW w:w="0" w:type="auto"/>
+            <w:vAlign w:val="center"/>
+          </w:tcPr>
+          <w:p>
+            <w:pPr>
+              <w:jc w:val="center"/>
+              <w:cnfStyle w:val="000000000000" w:firstRow="0" w:lastRow="0" w:firstColumn="0" w:lastColumn="0" w:oddVBand="0" w:evenVBand="0" w:oddHBand="0" w:evenHBand="0" w:firstRowFirstColumn="0" w:firstRowLastColumn="0" w:lastRowFirstColumn="0" w:lastRowLastColumn="0"/>
+              <w:rPr>
+                <w:rFonts w:cstheme="minorHAnsi"/>
+              </w:rPr>
+            </w:pPr>
+            <w:r>
+              <w:rPr>
+                <w:rFonts w:cstheme="minorHAnsi"/>
+                <w:color w:val="000000"/>
+              </w:rPr>
+              <w:t>hg19 (GRCh37)</w:t>
+            </w:r>
+          </w:p>
+        </w:tc>
+      </w:tr>
+      <w:tr>
+        <w:trPr>
+          <w:cnfStyle w:val="000000100000" w:firstRow="0" w:lastRow="0" w:firstColumn="0" w:lastColumn="0" w:oddVBand="0" w:evenVBand="0" w:oddHBand="1" w:evenHBand="0" w:firstRowFirstColumn="0" w:firstRowLastColumn="0" w:lastRowFirstColumn="0" w:lastRowLastColumn="0"/>
+        </w:trPr>
+        <w:tc>
+          <w:tcPr>
+            <w:cnfStyle w:val="001000000000" w:firstRow="0" w:lastRow="0" w:firstColumn="1" w:lastColumn="0" w:oddVBand="0" w:evenVBand="0" w:oddHBand="0" w:evenHBand="0" w:firstRowFirstColumn="0" w:firstRowLastColumn="0" w:lastRowFirstColumn="0" w:lastRowLastColumn="0"/>
+            <w:tcW w:w="0" w:type="auto"/>
+            <w:vAlign w:val="center"/>
+          </w:tcPr>
+          <w:p>
+            <w:pPr>
+              <w:jc w:val="center"/>
+              <w:rPr>
+                <w:rFonts w:cstheme="minorHAnsi"/>
+              </w:rPr>
+            </w:pPr>
+            <w:r>
+              <w:rPr>
+                <w:rFonts w:cstheme="minorHAnsi"/>
+                <w:color w:val="000000"/>
+              </w:rPr>
+              <w:t>GSE104836</w:t>
+            </w:r>
+          </w:p>
+        </w:tc>
+        <w:tc>
+          <w:tcPr>
+            <w:tcW w:w="0" w:type="auto"/>
+            <w:vAlign w:val="center"/>
+          </w:tcPr>
+          <w:p>
+            <w:pPr>
+              <w:jc w:val="center"/>
+              <w:cnfStyle w:val="000000100000" w:firstRow="0" w:lastRow="0" w:firstColumn="0" w:lastColumn="0" w:oddVBand="0" w:evenVBand="0" w:oddHBand="1" w:evenHBand="0" w:firstRowFirstColumn="0" w:firstRowLastColumn="0" w:lastRowFirstColumn="0" w:lastRowLastColumn="0"/>
+              <w:rPr>
+                <w:rFonts w:cstheme="minorHAnsi"/>
+              </w:rPr>
+            </w:pPr>
+            <w:r>
+              <w:rPr>
+                <w:rFonts w:cstheme="minorHAnsi"/>
+                <w:color w:val="000000"/>
+              </w:rPr>
+              <w:t>20</w:t>
+            </w:r>
+          </w:p>
+        </w:tc>
+        <w:tc>
+          <w:tcPr>
+            <w:tcW w:w="0" w:type="auto"/>
+            <w:vAlign w:val="center"/>
+          </w:tcPr>
+          <w:p>
+            <w:pPr>
+              <w:jc w:val="center"/>
+              <w:cnfStyle w:val="000000100000" w:firstRow="0" w:lastRow="0" w:firstColumn="0" w:lastColumn="0" w:oddVBand="0" w:evenVBand="0" w:oddHBand="1" w:evenHBand="0" w:firstRowFirstColumn="0" w:firstRowLastColumn="0" w:lastRowFirstColumn="0" w:lastRowLastColumn="0"/>
+              <w:rPr>
+                <w:rFonts w:cstheme="minorHAnsi"/>
+              </w:rPr>
+            </w:pPr>
+            <w:r>
+              <w:rPr>
+                <w:rFonts w:cstheme="minorHAnsi"/>
+                <w:color w:val="000000"/>
+              </w:rPr>
+              <w:t>10</w:t>
+            </w:r>
+          </w:p>
+        </w:tc>
+        <w:tc>
+          <w:tcPr>
+            <w:tcW w:w="0" w:type="auto"/>
+            <w:vAlign w:val="center"/>
+          </w:tcPr>
+          <w:p>
+            <w:pPr>
+              <w:jc w:val="center"/>
+              <w:cnfStyle w:val="000000100000" w:firstRow="0" w:lastRow="0" w:firstColumn="0" w:lastColumn="0" w:oddVBand="0" w:evenVBand="0" w:oddHBand="1" w:evenHBand="0" w:firstRowFirstColumn="0" w:firstRowLastColumn="0" w:lastRowFirstColumn="0" w:lastRowLastColumn="0"/>
+              <w:rPr>
+                <w:rFonts w:cstheme="minorHAnsi"/>
+              </w:rPr>
+            </w:pPr>
+            <w:r>
+              <w:rPr>
+                <w:rFonts w:cstheme="minorHAnsi"/>
+                <w:color w:val="000000"/>
+              </w:rPr>
+              <w:t>10</w:t>
+            </w:r>
+          </w:p>
+        </w:tc>
+        <w:tc>
+          <w:tcPr>
+            <w:tcW w:w="0" w:type="auto"/>
+            <w:vAlign w:val="center"/>
+          </w:tcPr>
+          <w:p>
+            <w:pPr>
+              <w:jc w:val="center"/>
+              <w:cnfStyle w:val="000000100000" w:firstRow="0" w:lastRow="0" w:firstColumn="0" w:lastColumn="0" w:oddVBand="0" w:evenVBand="0" w:oddHBand="1" w:evenHBand="0" w:firstRowFirstColumn="0" w:firstRowLastColumn="0" w:lastRowFirstColumn="0" w:lastRowLastColumn="0"/>
+              <w:rPr>
+                <w:rFonts w:cstheme="minorHAnsi"/>
+              </w:rPr>
+            </w:pPr>
+            <w:r>
+              <w:rPr>
+                <w:rFonts w:cstheme="minorHAnsi"/>
+                <w:color w:val="000000"/>
+              </w:rPr>
+              <w:t>N/A</w:t>
+            </w:r>
+          </w:p>
+        </w:tc>
+        <w:tc>
+          <w:tcPr>
+            <w:tcW w:w="0" w:type="auto"/>
+            <w:vAlign w:val="center"/>
+          </w:tcPr>
+          <w:p>
+            <w:pPr>
+              <w:jc w:val="center"/>
+              <w:cnfStyle w:val="000000100000" w:firstRow="0" w:lastRow="0" w:firstColumn="0" w:lastColumn="0" w:oddVBand="0" w:evenVBand="0" w:oddHBand="1" w:evenHBand="0" w:firstRowFirstColumn="0" w:firstRowLastColumn="0" w:lastRowFirstColumn="0" w:lastRowLastColumn="0"/>
+              <w:rPr>
+                <w:rFonts w:cstheme="minorHAnsi"/>
+              </w:rPr>
+            </w:pPr>
+            <w:r>
+              <w:rPr>
+                <w:rFonts w:cstheme="minorHAnsi"/>
+                <w:color w:val="000000"/>
+              </w:rPr>
+              <w:t>Sí</w:t>
+            </w:r>
+          </w:p>
+        </w:tc>
+        <w:tc>
+          <w:tcPr>
+            <w:tcW w:w="0" w:type="auto"/>
+            <w:vAlign w:val="center"/>
+          </w:tcPr>
+          <w:p>
+            <w:pPr>
+              <w:jc w:val="center"/>
+              <w:cnfStyle w:val="000000100000" w:firstRow="0" w:lastRow="0" w:firstColumn="0" w:lastColumn="0" w:oddVBand="0" w:evenVBand="0" w:oddHBand="1" w:evenHBand="0" w:firstRowFirstColumn="0" w:firstRowLastColumn="0" w:lastRowFirstColumn="0" w:lastRowLastColumn="0"/>
+              <w:rPr>
+                <w:rFonts w:cstheme="minorHAnsi"/>
+              </w:rPr>
+            </w:pPr>
+            <w:r>
+              <w:rPr>
+                <w:rFonts w:cstheme="minorHAnsi"/>
+                <w:color w:val="000000"/>
+              </w:rPr>
+              <w:t>hg38 (GRCh38)</w:t>
+            </w:r>
+          </w:p>
+        </w:tc>
+      </w:tr>
+      <w:tr>
+        <w:tc>
+          <w:tcPr>
+            <w:cnfStyle w:val="001000000000" w:firstRow="0" w:lastRow="0" w:firstColumn="1" w:lastColumn="0" w:oddVBand="0" w:evenVBand="0" w:oddHBand="0" w:evenHBand="0" w:firstRowFirstColumn="0" w:firstRowLastColumn="0" w:lastRowFirstColumn="0" w:lastRowLastColumn="0"/>
+            <w:tcW w:w="0" w:type="auto"/>
+            <w:vAlign w:val="center"/>
+          </w:tcPr>
+          <w:p>
+            <w:pPr>
+              <w:jc w:val="center"/>
+              <w:rPr>
+                <w:rFonts w:cstheme="minorHAnsi"/>
+              </w:rPr>
+            </w:pPr>
+            <w:r>
+              <w:rPr>
+                <w:rFonts w:cstheme="minorHAnsi"/>
+                <w:color w:val="000000"/>
+              </w:rPr>
+              <w:t>GSE142279</w:t>
+            </w:r>
+          </w:p>
+        </w:tc>
+        <w:tc>
+          <w:tcPr>
+            <w:tcW w:w="0" w:type="auto"/>
+            <w:vAlign w:val="center"/>
+          </w:tcPr>
+          <w:p>
+            <w:pPr>
+              <w:jc w:val="center"/>
+              <w:cnfStyle w:val="000000000000" w:firstRow="0" w:lastRow="0" w:firstColumn="0" w:lastColumn="0" w:oddVBand="0" w:evenVBand="0" w:oddHBand="0" w:evenHBand="0" w:firstRowFirstColumn="0" w:firstRowLastColumn="0" w:lastRowFirstColumn="0" w:lastRowLastColumn="0"/>
+              <w:rPr>
+                <w:rFonts w:cstheme="minorHAnsi"/>
+              </w:rPr>
+            </w:pPr>
+            <w:r>
+              <w:rPr>
+                <w:rFonts w:cstheme="minorHAnsi"/>
+                <w:color w:val="000000"/>
+              </w:rPr>
+              <w:t>40</w:t>
+            </w:r>
+          </w:p>
+        </w:tc>
+        <w:tc>
+          <w:tcPr>
+            <w:tcW w:w="0" w:type="auto"/>
+            <w:vAlign w:val="center"/>
+          </w:tcPr>
+          <w:p>
+            <w:pPr>
+              <w:jc w:val="center"/>
+              <w:cnfStyle w:val="000000000000" w:firstRow="0" w:lastRow="0" w:firstColumn="0" w:lastColumn="0" w:oddVBand="0" w:evenVBand="0" w:oddHBand="0" w:evenHBand="0" w:firstRowFirstColumn="0" w:firstRowLastColumn="0" w:lastRowFirstColumn="0" w:lastRowLastColumn="0"/>
+              <w:rPr>
+                <w:rFonts w:cstheme="minorHAnsi"/>
+              </w:rPr>
+            </w:pPr>
+            <w:r>
+              <w:rPr>
+                <w:rFonts w:cstheme="minorHAnsi"/>
+                <w:color w:val="000000"/>
+              </w:rPr>
+              <w:t>20</w:t>
+            </w:r>
+          </w:p>
+        </w:tc>
+        <w:tc>
+          <w:tcPr>
+            <w:tcW w:w="0" w:type="auto"/>
+            <w:vAlign w:val="center"/>
+          </w:tcPr>
+          <w:p>
+            <w:pPr>
+              <w:jc w:val="center"/>
+              <w:cnfStyle w:val="000000000000" w:firstRow="0" w:lastRow="0" w:firstColumn="0" w:lastColumn="0" w:oddVBand="0" w:evenVBand="0" w:oddHBand="0" w:evenHBand="0" w:firstRowFirstColumn="0" w:firstRowLastColumn="0" w:lastRowFirstColumn="0" w:lastRowLastColumn="0"/>
+              <w:rPr>
+                <w:rFonts w:cstheme="minorHAnsi"/>
+              </w:rPr>
+            </w:pPr>
+            <w:r>
+              <w:rPr>
+                <w:rFonts w:cstheme="minorHAnsi"/>
+                <w:color w:val="000000"/>
+              </w:rPr>
+              <w:t>20</w:t>
+            </w:r>
+          </w:p>
+        </w:tc>
+        <w:tc>
+          <w:tcPr>
+            <w:tcW w:w="0" w:type="auto"/>
+            <w:vAlign w:val="center"/>
+          </w:tcPr>
+          <w:p>
+            <w:pPr>
+              <w:jc w:val="center"/>
+              <w:cnfStyle w:val="000000000000" w:firstRow="0" w:lastRow="0" w:firstColumn="0" w:lastColumn="0" w:oddVBand="0" w:evenVBand="0" w:oddHBand="0" w:evenHBand="0" w:firstRowFirstColumn="0" w:firstRowLastColumn="0" w:lastRowFirstColumn="0" w:lastRowLastColumn="0"/>
+              <w:rPr>
+                <w:rFonts w:cstheme="minorHAnsi"/>
+              </w:rPr>
+            </w:pPr>
+            <w:r>
+              <w:rPr>
+                <w:rFonts w:cstheme="minorHAnsi"/>
+                <w:color w:val="000000"/>
+              </w:rPr>
+              <w:t>N/A</w:t>
+            </w:r>
+          </w:p>
+        </w:tc>
+        <w:tc>
+          <w:tcPr>
+            <w:tcW w:w="0" w:type="auto"/>
+            <w:vAlign w:val="center"/>
+          </w:tcPr>
+          <w:p>
+            <w:pPr>
+              <w:jc w:val="center"/>
+              <w:cnfStyle w:val="000000000000" w:firstRow="0" w:lastRow="0" w:firstColumn="0" w:lastColumn="0" w:oddVBand="0" w:evenVBand="0" w:oddHBand="0" w:evenHBand="0" w:firstRowFirstColumn="0" w:firstRowLastColumn="0" w:lastRowFirstColumn="0" w:lastRowLastColumn="0"/>
+              <w:rPr>
+                <w:rFonts w:cstheme="minorHAnsi"/>
+              </w:rPr>
+            </w:pPr>
+            <w:r>
+              <w:rPr>
+                <w:rFonts w:cstheme="minorHAnsi"/>
+                <w:color w:val="000000"/>
+              </w:rPr>
+              <w:t>Sí</w:t>
+            </w:r>
+          </w:p>
+        </w:tc>
+        <w:tc>
+          <w:tcPr>
+            <w:tcW w:w="0" w:type="auto"/>
+            <w:vAlign w:val="center"/>
+          </w:tcPr>
+          <w:p>
+            <w:pPr>
+              <w:jc w:val="center"/>
+              <w:cnfStyle w:val="000000000000" w:firstRow="0" w:lastRow="0" w:firstColumn="0" w:lastColumn="0" w:oddVBand="0" w:evenVBand="0" w:oddHBand="0" w:evenHBand="0" w:firstRowFirstColumn="0" w:firstRowLastColumn="0" w:lastRowFirstColumn="0" w:lastRowLastColumn="0"/>
+              <w:rPr>
+                <w:rFonts w:cstheme="minorHAnsi"/>
+              </w:rPr>
+            </w:pPr>
+            <w:r>
+              <w:rPr>
+                <w:rFonts w:cstheme="minorHAnsi"/>
+                <w:color w:val="000000"/>
+              </w:rPr>
+              <w:t>hg38 (GRCh38)</w:t>
+            </w:r>
+          </w:p>
+        </w:tc>
+      </w:tr>
+      <w:tr>
+        <w:trPr>
+          <w:cnfStyle w:val="000000100000" w:firstRow="0" w:lastRow="0" w:firstColumn="0" w:lastColumn="0" w:oddVBand="0" w:evenVBand="0" w:oddHBand="1" w:evenHBand="0" w:firstRowFirstColumn="0" w:firstRowLastColumn="0" w:lastRowFirstColumn="0" w:lastRowLastColumn="0"/>
+        </w:trPr>
+        <w:tc>
+          <w:tcPr>
+            <w:cnfStyle w:val="001000000000" w:firstRow="0" w:lastRow="0" w:firstColumn="1" w:lastColumn="0" w:oddVBand="0" w:evenVBand="0" w:oddHBand="0" w:evenHBand="0" w:firstRowFirstColumn="0" w:firstRowLastColumn="0" w:lastRowFirstColumn="0" w:lastRowLastColumn="0"/>
+            <w:tcW w:w="0" w:type="auto"/>
+            <w:vAlign w:val="center"/>
+          </w:tcPr>
+          <w:p>
+            <w:pPr>
+              <w:jc w:val="center"/>
+              <w:rPr>
+                <w:rFonts w:cstheme="minorHAnsi"/>
+              </w:rPr>
+            </w:pPr>
+            <w:r>
+              <w:rPr>
+                <w:rFonts w:cstheme="minorHAnsi"/>
+                <w:color w:val="000000"/>
+              </w:rPr>
+              <w:t>GSE156451</w:t>
+            </w:r>
+          </w:p>
+        </w:tc>
+        <w:tc>
+          <w:tcPr>
+            <w:tcW w:w="0" w:type="auto"/>
+            <w:vAlign w:val="center"/>
+          </w:tcPr>
+          <w:p>
+            <w:pPr>
+              <w:jc w:val="center"/>
+              <w:cnfStyle w:val="000000100000" w:firstRow="0" w:lastRow="0" w:firstColumn="0" w:lastColumn="0" w:oddVBand="0" w:evenVBand="0" w:oddHBand="1" w:evenHBand="0" w:firstRowFirstColumn="0" w:firstRowLastColumn="0" w:lastRowFirstColumn="0" w:lastRowLastColumn="0"/>
+              <w:rPr>
+                <w:rFonts w:cstheme="minorHAnsi"/>
+              </w:rPr>
+            </w:pPr>
+            <w:r>
+              <w:rPr>
+                <w:rFonts w:cstheme="minorHAnsi"/>
+                <w:color w:val="000000"/>
+              </w:rPr>
+              <w:t>95</w:t>
+            </w:r>
+          </w:p>
+        </w:tc>
+        <w:tc>
+          <w:tcPr>
+            <w:tcW w:w="0" w:type="auto"/>
+            <w:vAlign w:val="center"/>
+          </w:tcPr>
+          <w:p>
+            <w:pPr>
+              <w:jc w:val="center"/>
+              <w:cnfStyle w:val="000000100000" w:firstRow="0" w:lastRow="0" w:firstColumn="0" w:lastColumn="0" w:oddVBand="0" w:evenVBand="0" w:oddHBand="1" w:evenHBand="0" w:firstRowFirstColumn="0" w:firstRowLastColumn="0" w:lastRowFirstColumn="0" w:lastRowLastColumn="0"/>
+              <w:rPr>
+                <w:rFonts w:cstheme="minorHAnsi"/>
+              </w:rPr>
+            </w:pPr>
+            <w:r>
+              <w:rPr>
+                <w:rFonts w:cstheme="minorHAnsi"/>
+                <w:color w:val="000000"/>
+              </w:rPr>
+              <w:t>47</w:t>
+            </w:r>
+          </w:p>
+        </w:tc>
+        <w:tc>
+          <w:tcPr>
+            <w:tcW w:w="0" w:type="auto"/>
+            <w:vAlign w:val="center"/>
+          </w:tcPr>
+          <w:p>
+            <w:pPr>
+              <w:jc w:val="center"/>
+              <w:cnfStyle w:val="000000100000" w:firstRow="0" w:lastRow="0" w:firstColumn="0" w:lastColumn="0" w:oddVBand="0" w:evenVBand="0" w:oddHBand="1" w:evenHBand="0" w:firstRowFirstColumn="0" w:firstRowLastColumn="0" w:lastRowFirstColumn="0" w:lastRowLastColumn="0"/>
+              <w:rPr>
+                <w:rFonts w:cstheme="minorHAnsi"/>
+              </w:rPr>
+            </w:pPr>
+            <w:r>
+              <w:rPr>
+                <w:rFonts w:cstheme="minorHAnsi"/>
+                <w:color w:val="000000"/>
+              </w:rPr>
+              <w:t>48</w:t>
+            </w:r>
+          </w:p>
+        </w:tc>
+        <w:tc>
+          <w:tcPr>
+            <w:tcW w:w="0" w:type="auto"/>
+            <w:vAlign w:val="center"/>
+          </w:tcPr>
+          <w:p>
+            <w:pPr>
+              <w:jc w:val="center"/>
+              <w:cnfStyle w:val="000000100000" w:firstRow="0" w:lastRow="0" w:firstColumn="0" w:lastColumn="0" w:oddVBand="0" w:evenVBand="0" w:oddHBand="1" w:evenHBand="0" w:firstRowFirstColumn="0" w:firstRowLastColumn="0" w:lastRowFirstColumn="0" w:lastRowLastColumn="0"/>
+              <w:rPr>
+                <w:rFonts w:cstheme="minorHAnsi"/>
+              </w:rPr>
+            </w:pPr>
+            <w:r>
+              <w:rPr>
+                <w:rFonts w:cstheme="minorHAnsi"/>
+                <w:color w:val="000000"/>
+              </w:rPr>
+              <w:t>N/A</w:t>
+            </w:r>
+          </w:p>
+        </w:tc>
+        <w:tc>
+          <w:tcPr>
+            <w:tcW w:w="0" w:type="auto"/>
+            <w:vAlign w:val="center"/>
+          </w:tcPr>
+          <w:p>
+            <w:pPr>
+              <w:jc w:val="center"/>
+              <w:cnfStyle w:val="000000100000" w:firstRow="0" w:lastRow="0" w:firstColumn="0" w:lastColumn="0" w:oddVBand="0" w:evenVBand="0" w:oddHBand="1" w:evenHBand="0" w:firstRowFirstColumn="0" w:firstRowLastColumn="0" w:lastRowFirstColumn="0" w:lastRowLastColumn="0"/>
+              <w:rPr>
+                <w:rFonts w:cstheme="minorHAnsi"/>
+              </w:rPr>
+            </w:pPr>
+            <w:r>
+              <w:rPr>
+                <w:rFonts w:cstheme="minorHAnsi"/>
+                <w:color w:val="000000"/>
+              </w:rPr>
+              <w:t>Sí</w:t>
+            </w:r>
+          </w:p>
+        </w:tc>
+        <w:tc>
+          <w:tcPr>
+            <w:tcW w:w="0" w:type="auto"/>
+            <w:vAlign w:val="center"/>
+          </w:tcPr>
+          <w:p>
+            <w:pPr>
+              <w:jc w:val="center"/>
+              <w:cnfStyle w:val="000000100000" w:firstRow="0" w:lastRow="0" w:firstColumn="0" w:lastColumn="0" w:oddVBand="0" w:evenVBand="0" w:oddHBand="1" w:evenHBand="0" w:firstRowFirstColumn="0" w:firstRowLastColumn="0" w:lastRowFirstColumn="0" w:lastRowLastColumn="0"/>
+              <w:rPr>
+                <w:rFonts w:cstheme="minorHAnsi"/>
+              </w:rPr>
+            </w:pPr>
+            <w:r>
+              <w:rPr>
+                <w:rFonts w:cstheme="minorHAnsi"/>
+                <w:color w:val="000000"/>
+              </w:rPr>
+              <w:t>hg19 (GRCh37)</w:t>
+            </w:r>
+          </w:p>
+        </w:tc>
+      </w:tr>
+      <w:tr>
+        <w:tc>
+          <w:tcPr>
+            <w:cnfStyle w:val="001000000000" w:firstRow="0" w:lastRow="0" w:firstColumn="1" w:lastColumn="0" w:oddVBand="0" w:evenVBand="0" w:oddHBand="0" w:evenHBand="0" w:firstRowFirstColumn="0" w:firstRowLastColumn="0" w:lastRowFirstColumn="0" w:lastRowLastColumn="0"/>
+            <w:tcW w:w="0" w:type="auto"/>
+            <w:vAlign w:val="center"/>
+          </w:tcPr>
+          <w:p>
+            <w:pPr>
+              <w:jc w:val="center"/>
+              <w:rPr>
+                <w:rFonts w:cstheme="minorHAnsi"/>
+              </w:rPr>
+            </w:pPr>
+            <w:r>
+              <w:rPr>
+                <w:rFonts w:cstheme="minorHAnsi"/>
+                <w:color w:val="000000"/>
+              </w:rPr>
+              <w:t>GSE164541</w:t>
+            </w:r>
+          </w:p>
+        </w:tc>
+        <w:tc>
+          <w:tcPr>
+            <w:tcW w:w="0" w:type="auto"/>
+            <w:vAlign w:val="center"/>
+          </w:tcPr>
+          <w:p>
+            <w:pPr>
+              <w:jc w:val="center"/>
+              <w:cnfStyle w:val="000000000000" w:firstRow="0" w:lastRow="0" w:firstColumn="0" w:lastColumn="0" w:oddVBand="0" w:evenVBand="0" w:oddHBand="0" w:evenHBand="0" w:firstRowFirstColumn="0" w:firstRowLastColumn="0" w:lastRowFirstColumn="0" w:lastRowLastColumn="0"/>
+              <w:rPr>
+                <w:rFonts w:cstheme="minorHAnsi"/>
+              </w:rPr>
+            </w:pPr>
+            <w:r>
+              <w:rPr>
+                <w:rFonts w:cstheme="minorHAnsi"/>
+                <w:color w:val="000000"/>
+              </w:rPr>
+              <w:t>15</w:t>
+            </w:r>
+          </w:p>
+        </w:tc>
+        <w:tc>
+          <w:tcPr>
+            <w:tcW w:w="0" w:type="auto"/>
+            <w:vAlign w:val="center"/>
+          </w:tcPr>
+          <w:p>
+            <w:pPr>
+              <w:jc w:val="center"/>
+              <w:cnfStyle w:val="000000000000" w:firstRow="0" w:lastRow="0" w:firstColumn="0" w:lastColumn="0" w:oddVBand="0" w:evenVBand="0" w:oddHBand="0" w:evenHBand="0" w:firstRowFirstColumn="0" w:firstRowLastColumn="0" w:lastRowFirstColumn="0" w:lastRowLastColumn="0"/>
+              <w:rPr>
+                <w:rFonts w:cstheme="minorHAnsi"/>
+              </w:rPr>
+            </w:pPr>
+            <w:r>
+              <w:rPr>
+                <w:rFonts w:cstheme="minorHAnsi"/>
+                <w:color w:val="000000"/>
+              </w:rPr>
+              <w:t>5</w:t>
+            </w:r>
+          </w:p>
+        </w:tc>
+        <w:tc>
+          <w:tcPr>
+            <w:tcW w:w="0" w:type="auto"/>
+            <w:vAlign w:val="center"/>
+          </w:tcPr>
+          <w:p>
+            <w:pPr>
+              <w:jc w:val="center"/>
+              <w:cnfStyle w:val="000000000000" w:firstRow="0" w:lastRow="0" w:firstColumn="0" w:lastColumn="0" w:oddVBand="0" w:evenVBand="0" w:oddHBand="0" w:evenHBand="0" w:firstRowFirstColumn="0" w:firstRowLastColumn="0" w:lastRowFirstColumn="0" w:lastRowLastColumn="0"/>
+              <w:rPr>
+                <w:rFonts w:cstheme="minorHAnsi"/>
+              </w:rPr>
+            </w:pPr>
+            <w:r>
+              <w:rPr>
+                <w:rFonts w:cstheme="minorHAnsi"/>
+                <w:color w:val="000000"/>
+              </w:rPr>
+              <w:t>5</w:t>
+            </w:r>
+          </w:p>
+        </w:tc>
+        <w:tc>
+          <w:tcPr>
+            <w:tcW w:w="0" w:type="auto"/>
+            <w:vAlign w:val="center"/>
+          </w:tcPr>
+          <w:p>
+            <w:pPr>
+              <w:jc w:val="center"/>
+              <w:cnfStyle w:val="000000000000" w:firstRow="0" w:lastRow="0" w:firstColumn="0" w:lastColumn="0" w:oddVBand="0" w:evenVBand="0" w:oddHBand="0" w:evenHBand="0" w:firstRowFirstColumn="0" w:firstRowLastColumn="0" w:lastRowFirstColumn="0" w:lastRowLastColumn="0"/>
+              <w:rPr>
+                <w:rFonts w:cstheme="minorHAnsi"/>
+              </w:rPr>
+            </w:pPr>
+            <w:r>
+              <w:rPr>
+                <w:rFonts w:cstheme="minorHAnsi"/>
+                <w:color w:val="000000"/>
+              </w:rPr>
+              <w:t>5 (Adenoma)</w:t>
+            </w:r>
+          </w:p>
+        </w:tc>
+        <w:tc>
+          <w:tcPr>
+            <w:tcW w:w="0" w:type="auto"/>
+            <w:vAlign w:val="center"/>
+          </w:tcPr>
+          <w:p>
+            <w:pPr>
+              <w:jc w:val="center"/>
+              <w:cnfStyle w:val="000000000000" w:firstRow="0" w:lastRow="0" w:firstColumn="0" w:lastColumn="0" w:oddVBand="0" w:evenVBand="0" w:oddHBand="0" w:evenHBand="0" w:firstRowFirstColumn="0" w:firstRowLastColumn="0" w:lastRowFirstColumn="0" w:lastRowLastColumn="0"/>
+              <w:rPr>
+                <w:rFonts w:cstheme="minorHAnsi"/>
+              </w:rPr>
+            </w:pPr>
+            <w:r>
+              <w:rPr>
+                <w:rFonts w:cstheme="minorHAnsi"/>
+                <w:color w:val="000000"/>
+              </w:rPr>
+              <w:t>Sí</w:t>
+            </w:r>
+          </w:p>
+        </w:tc>
+        <w:tc>
+          <w:tcPr>
+            <w:tcW w:w="0" w:type="auto"/>
+            <w:vAlign w:val="center"/>
+          </w:tcPr>
+          <w:p>
+            <w:pPr>
+              <w:jc w:val="center"/>
+              <w:cnfStyle w:val="000000000000" w:firstRow="0" w:lastRow="0" w:firstColumn="0" w:lastColumn="0" w:oddVBand="0" w:evenVBand="0" w:oddHBand="0" w:evenHBand="0" w:firstRowFirstColumn="0" w:firstRowLastColumn="0" w:lastRowFirstColumn="0" w:lastRowLastColumn="0"/>
+              <w:rPr>
+                <w:rFonts w:cstheme="minorHAnsi"/>
+              </w:rPr>
+            </w:pPr>
+            <w:r>
+              <w:rPr>
+                <w:rFonts w:cstheme="minorHAnsi"/>
+                <w:color w:val="000000"/>
+              </w:rPr>
+              <w:t>hg38 (GRCh38)</w:t>
+            </w:r>
+          </w:p>
+        </w:tc>
+      </w:tr>
+      <w:tr>
+        <w:trPr>
+          <w:cnfStyle w:val="000000100000" w:firstRow="0" w:lastRow="0" w:firstColumn="0" w:lastColumn="0" w:oddVBand="0" w:evenVBand="0" w:oddHBand="1" w:evenHBand="0" w:firstRowFirstColumn="0" w:firstRowLastColumn="0" w:lastRowFirstColumn="0" w:lastRowLastColumn="0"/>
+        </w:trPr>
+        <w:tc>
+          <w:tcPr>
+            <w:cnfStyle w:val="001000000000" w:firstRow="0" w:lastRow="0" w:firstColumn="1" w:lastColumn="0" w:oddVBand="0" w:evenVBand="0" w:oddHBand="0" w:evenHBand="0" w:firstRowFirstColumn="0" w:firstRowLastColumn="0" w:lastRowFirstColumn="0" w:lastRowLastColumn="0"/>
+            <w:tcW w:w="0" w:type="auto"/>
+            <w:vAlign w:val="center"/>
+          </w:tcPr>
+          <w:p>
+            <w:pPr>
+              <w:jc w:val="center"/>
+              <w:rPr>
+                <w:rFonts w:cstheme="minorHAnsi"/>
+              </w:rPr>
+            </w:pPr>
+            <w:r>
+              <w:rPr>
+                <w:rFonts w:cstheme="minorHAnsi"/>
+                <w:color w:val="000000"/>
+              </w:rPr>
+              <w:t>TCGA-COAD</w:t>
+            </w:r>
+          </w:p>
+        </w:tc>
+        <w:tc>
+          <w:tcPr>
+            <w:tcW w:w="0" w:type="auto"/>
+            <w:vAlign w:val="center"/>
+          </w:tcPr>
+          <w:p>
+            <w:pPr>
+              <w:jc w:val="center"/>
+              <w:cnfStyle w:val="000000100000" w:firstRow="0" w:lastRow="0" w:firstColumn="0" w:lastColumn="0" w:oddVBand="0" w:evenVBand="0" w:oddHBand="1" w:evenHBand="0" w:firstRowFirstColumn="0" w:firstRowLastColumn="0" w:lastRowFirstColumn="0" w:lastRowLastColumn="0"/>
+              <w:rPr>
+                <w:rFonts w:cstheme="minorHAnsi"/>
+              </w:rPr>
+            </w:pPr>
+            <w:r>
+              <w:rPr>
+                <w:rFonts w:cstheme="minorHAnsi"/>
+                <w:color w:val="000000"/>
+              </w:rPr>
+              <w:t>524</w:t>
+            </w:r>
+          </w:p>
+        </w:tc>
+        <w:tc>
+          <w:tcPr>
+            <w:tcW w:w="0" w:type="auto"/>
+            <w:vAlign w:val="center"/>
+          </w:tcPr>
+          <w:p>
+            <w:pPr>
+              <w:jc w:val="center"/>
+              <w:cnfStyle w:val="000000100000" w:firstRow="0" w:lastRow="0" w:firstColumn="0" w:lastColumn="0" w:oddVBand="0" w:evenVBand="0" w:oddHBand="1" w:evenHBand="0" w:firstRowFirstColumn="0" w:firstRowLastColumn="0" w:lastRowFirstColumn="0" w:lastRowLastColumn="0"/>
+              <w:rPr>
+                <w:rFonts w:cstheme="minorHAnsi"/>
+              </w:rPr>
+            </w:pPr>
+          </w:p>
+        </w:tc>
+        <w:tc>
+          <w:tcPr>
+            <w:tcW w:w="0" w:type="auto"/>
+            <w:vAlign w:val="center"/>
+          </w:tcPr>
+          <w:p>
+            <w:pPr>
+              <w:jc w:val="center"/>
+              <w:cnfStyle w:val="000000100000" w:firstRow="0" w:lastRow="0" w:firstColumn="0" w:lastColumn="0" w:oddVBand="0" w:evenVBand="0" w:oddHBand="1" w:evenHBand="0" w:firstRowFirstColumn="0" w:firstRowLastColumn="0" w:lastRowFirstColumn="0" w:lastRowLastColumn="0"/>
+              <w:rPr>
+                <w:rFonts w:cstheme="minorHAnsi"/>
+              </w:rPr>
+            </w:pPr>
+          </w:p>
+        </w:tc>
+        <w:tc>
+          <w:tcPr>
+            <w:tcW w:w="0" w:type="auto"/>
+            <w:vAlign w:val="center"/>
+          </w:tcPr>
+          <w:p>
+            <w:pPr>
+              <w:jc w:val="center"/>
+              <w:cnfStyle w:val="000000100000" w:firstRow="0" w:lastRow="0" w:firstColumn="0" w:lastColumn="0" w:oddVBand="0" w:evenVBand="0" w:oddHBand="1" w:evenHBand="0" w:firstRowFirstColumn="0" w:firstRowLastColumn="0" w:lastRowFirstColumn="0" w:lastRowLastColumn="0"/>
+              <w:rPr>
+                <w:rFonts w:cstheme="minorHAnsi"/>
+              </w:rPr>
+            </w:pPr>
+            <w:r>
+              <w:rPr>
+                <w:rFonts w:cstheme="minorHAnsi"/>
+                <w:color w:val="000000"/>
+              </w:rPr>
+              <w:t>N/A</w:t>
+            </w:r>
+          </w:p>
+        </w:tc>
+        <w:tc>
+          <w:tcPr>
+            <w:tcW w:w="0" w:type="auto"/>
+            <w:vAlign w:val="center"/>
+          </w:tcPr>
+          <w:p>
+            <w:pPr>
+              <w:jc w:val="center"/>
+              <w:cnfStyle w:val="000000100000" w:firstRow="0" w:lastRow="0" w:firstColumn="0" w:lastColumn="0" w:oddVBand="0" w:evenVBand="0" w:oddHBand="1" w:evenHBand="0" w:firstRowFirstColumn="0" w:firstRowLastColumn="0" w:lastRowFirstColumn="0" w:lastRowLastColumn="0"/>
+              <w:rPr>
+                <w:rFonts w:cstheme="minorHAnsi"/>
+              </w:rPr>
+            </w:pPr>
+            <w:r>
+              <w:rPr>
+                <w:rFonts w:cstheme="minorHAnsi"/>
+                <w:color w:val="000000"/>
+              </w:rPr>
+              <w:t>No</w:t>
+            </w:r>
+          </w:p>
+        </w:tc>
+        <w:tc>
+          <w:tcPr>
+            <w:tcW w:w="0" w:type="auto"/>
+            <w:vAlign w:val="center"/>
+          </w:tcPr>
+          <w:p>
+            <w:pPr>
+              <w:jc w:val="center"/>
+              <w:cnfStyle w:val="000000100000" w:firstRow="0" w:lastRow="0" w:firstColumn="0" w:lastColumn="0" w:oddVBand="0" w:evenVBand="0" w:oddHBand="1" w:evenHBand="0" w:firstRowFirstColumn="0" w:firstRowLastColumn="0" w:lastRowFirstColumn="0" w:lastRowLastColumn="0"/>
+              <w:rPr>
+                <w:rFonts w:cstheme="minorHAnsi"/>
+              </w:rPr>
+            </w:pPr>
+            <w:r>
+              <w:rPr>
+                <w:rFonts w:cstheme="minorHAnsi"/>
+                <w:color w:val="000000"/>
+              </w:rPr>
+              <w:t>hg38 (GRCh38)</w:t>
+            </w:r>
+          </w:p>
+        </w:tc>
+      </w:tr>
+    </w:tbl>
+    <w:p>
+      <w:pPr>
+        <w:spacing w:before="0" w:after="0" w:line="240" w:lineRule="auto"/>
+        <w:jc w:val="left"/>
+      </w:pPr>
+      <w:r>
+        <w:br w:type="page"/>
+      </w:r>
     </w:p>
     <w:p/>
     <w:p>
@@ -5797,78 +6843,28 @@
         </w:rPr>
         <w:t xml:space="preserve"> </w:t>
       </w:r>
-      <w:bookmarkStart w:id="27" w:name="_Toc226279076"/>
+      <w:bookmarkStart w:id="31" w:name="_Toc228992849"/>
       <w:r>
         <w:rPr>
           <w:caps w:val="0"/>
         </w:rPr>
         <w:t>Herramientas de Análisis</w:t>
       </w:r>
-      <w:bookmarkEnd w:id="27"/>
+      <w:bookmarkEnd w:id="31"/>
     </w:p>
     <w:p>
       <w:pPr>
         <w:pStyle w:val="Ttulo3"/>
       </w:pPr>
-      <w:bookmarkStart w:id="28" w:name="_Toc226279077"/>
+      <w:bookmarkStart w:id="32" w:name="_Toc228992850"/>
       <w:r>
         <w:t>“Título 3” del menú de estilos</w:t>
       </w:r>
-      <w:bookmarkEnd w:id="28"/>
-    </w:p>
-    <w:p>
-      <w:r>
-        <w:t xml:space="preserve">Para la unificación de los identificadores de genes se utilizó </w:t>
-      </w:r>
-      <w:proofErr w:type="spellStart"/>
-      <w:r>
-        <w:t>AnnotationHub</w:t>
-      </w:r>
-      <w:proofErr w:type="spellEnd"/>
-      <w:r>
-        <w:t xml:space="preserve">, asegurando la correspondencia entre las versiones hg19 y hg38 de los diferentes </w:t>
-      </w:r>
-      <w:proofErr w:type="spellStart"/>
-      <w:r>
-        <w:t>datasets</w:t>
-      </w:r>
-      <w:proofErr w:type="spellEnd"/>
-    </w:p>
-    <w:p>
-      <w:r>
-        <w:t xml:space="preserve">"Dada la heterogeneidad en las versiones de ensamblaje genómico de los </w:t>
-      </w:r>
-      <w:proofErr w:type="spellStart"/>
-      <w:r>
-        <w:t>datasets</w:t>
-      </w:r>
-      <w:proofErr w:type="spellEnd"/>
-      <w:r>
-        <w:t xml:space="preserve"> seleccionados (hg19 y hg38), se descartó el uso de tablas de anotación estáticas. En su lugar, se empleó </w:t>
-      </w:r>
-      <w:proofErr w:type="spellStart"/>
-      <w:r>
-        <w:rPr>
-          <w:b/>
-          <w:bCs/>
-        </w:rPr>
-        <w:t>AnnotationHub</w:t>
-      </w:r>
-      <w:proofErr w:type="spellEnd"/>
-      <w:r>
-        <w:t xml:space="preserve"> para acceder a bases de datos de anotación específicas (</w:t>
-      </w:r>
-      <w:proofErr w:type="spellStart"/>
-      <w:r>
-        <w:rPr>
-          <w:b/>
-          <w:bCs/>
-        </w:rPr>
-        <w:t>EnsDb</w:t>
-      </w:r>
-      <w:proofErr w:type="spellEnd"/>
-      <w:r>
-        <w:t>) compatibles con la versión del genoma de referencia de cada estudio. Este enfoque híbrido garantiza la máxima precisión en el mapeo de identificadores y evita la pérdida de información biológica derivada de las discrepancias entre versiones del genoma."</w:t>
+      <w:bookmarkEnd w:id="32"/>
+    </w:p>
+    <w:p>
+      <w:r>
+        <w:t>sdgg</w:t>
       </w:r>
     </w:p>
     <w:p>
@@ -5893,24 +6889,24 @@
       <w:pPr>
         <w:pStyle w:val="Ttulo2"/>
       </w:pPr>
-      <w:bookmarkStart w:id="29" w:name="_Toc226279078"/>
+      <w:bookmarkStart w:id="33" w:name="_Toc228992851"/>
       <w:r>
         <w:rPr>
           <w:caps w:val="0"/>
         </w:rPr>
         <w:t>Procesamiento de Datos</w:t>
       </w:r>
-      <w:bookmarkEnd w:id="29"/>
+      <w:bookmarkEnd w:id="33"/>
     </w:p>
     <w:p>
       <w:pPr>
         <w:pStyle w:val="Ttulo3"/>
       </w:pPr>
-      <w:bookmarkStart w:id="30" w:name="_Toc226279079"/>
+      <w:bookmarkStart w:id="34" w:name="_Toc228992852"/>
       <w:r>
         <w:t>“Título 3” del menú de estilos</w:t>
       </w:r>
-      <w:bookmarkEnd w:id="30"/>
+      <w:bookmarkEnd w:id="34"/>
     </w:p>
     <w:p/>
     <w:p>
@@ -5923,14 +6919,14 @@
         </w:rPr>
         <w:t xml:space="preserve"> </w:t>
       </w:r>
-      <w:bookmarkStart w:id="31" w:name="_Toc226279080"/>
+      <w:bookmarkStart w:id="35" w:name="_Toc228992853"/>
       <w:r>
         <w:rPr>
           <w:caps w:val="0"/>
         </w:rPr>
         <w:t>Análisis Estadístico</w:t>
       </w:r>
-      <w:bookmarkEnd w:id="31"/>
+      <w:bookmarkEnd w:id="35"/>
     </w:p>
     <w:p/>
     <w:p>
@@ -5946,7 +6942,7 @@
       <w:pPr>
         <w:pStyle w:val="Ttulo1"/>
       </w:pPr>
-      <w:bookmarkStart w:id="32" w:name="_Toc226279081"/>
+      <w:bookmarkStart w:id="36" w:name="_Toc228992854"/>
       <w:r>
         <w:rPr>
           <w:caps w:val="0"/>
@@ -5954,30 +6950,30 @@
         <w:lastRenderedPageBreak/>
         <w:t>Resultados</w:t>
       </w:r>
-      <w:bookmarkEnd w:id="32"/>
+      <w:bookmarkEnd w:id="36"/>
     </w:p>
     <w:p>
       <w:pPr>
         <w:pStyle w:val="Ttulo2"/>
       </w:pPr>
-      <w:bookmarkStart w:id="33" w:name="_Toc226279082"/>
+      <w:bookmarkStart w:id="37" w:name="_Toc228992855"/>
       <w:r>
         <w:rPr>
           <w:caps w:val="0"/>
         </w:rPr>
         <w:t>Identificación de Genes Diferencialmente Expresados</w:t>
       </w:r>
-      <w:bookmarkEnd w:id="33"/>
+      <w:bookmarkEnd w:id="37"/>
     </w:p>
     <w:p>
       <w:pPr>
         <w:pStyle w:val="Ttulo3"/>
       </w:pPr>
-      <w:bookmarkStart w:id="34" w:name="_Toc226279083"/>
+      <w:bookmarkStart w:id="38" w:name="_Toc228992856"/>
       <w:r>
         <w:t>“Título 3” del menú de estilos</w:t>
       </w:r>
-      <w:bookmarkEnd w:id="34"/>
+      <w:bookmarkEnd w:id="38"/>
     </w:p>
     <w:p>
       <w:pPr>
@@ -5992,100 +6988,86 @@
       <w:pPr>
         <w:pStyle w:val="Ttulo2"/>
       </w:pPr>
-      <w:bookmarkStart w:id="35" w:name="_Toc226279084"/>
+      <w:bookmarkStart w:id="39" w:name="_Toc228992857"/>
       <w:r>
         <w:rPr>
           <w:caps w:val="0"/>
         </w:rPr>
-        <w:t xml:space="preserve">Validación en </w:t>
-      </w:r>
-      <w:proofErr w:type="spellStart"/>
+        <w:t>Validación en Datasets Independientes</w:t>
+      </w:r>
+      <w:bookmarkEnd w:id="39"/>
+    </w:p>
+    <w:p>
+      <w:pPr>
+        <w:pStyle w:val="Ttulo3"/>
+      </w:pPr>
+      <w:bookmarkStart w:id="40" w:name="_Toc228992858"/>
+      <w:r>
+        <w:t>“Título 3” del menú de estilos</w:t>
+      </w:r>
+      <w:bookmarkEnd w:id="40"/>
+    </w:p>
+    <w:p/>
+    <w:p>
+      <w:pPr>
+        <w:pStyle w:val="Ttulo2"/>
+      </w:pPr>
+      <w:bookmarkStart w:id="41" w:name="_Toc228992859"/>
       <w:r>
         <w:rPr>
           <w:caps w:val="0"/>
         </w:rPr>
-        <w:t>Datasets</w:t>
-      </w:r>
-      <w:proofErr w:type="spellEnd"/>
+        <w:t>Análisis de Enriquecimiento Funcional</w:t>
+      </w:r>
+      <w:bookmarkEnd w:id="41"/>
+    </w:p>
+    <w:p>
+      <w:pPr>
+        <w:pStyle w:val="Ttulo3"/>
+      </w:pPr>
+      <w:bookmarkStart w:id="42" w:name="_Toc228992860"/>
+      <w:r>
+        <w:t>“Título 3” del menú de estilos</w:t>
+      </w:r>
+      <w:bookmarkEnd w:id="42"/>
+    </w:p>
+    <w:p>
+      <w:pPr>
+        <w:pStyle w:val="Ttulo4"/>
+      </w:pPr>
+      <w:r>
+        <w:t xml:space="preserve">“Título </w:t>
+      </w:r>
+      <w:r>
+        <w:t>4</w:t>
+      </w:r>
+      <w:r>
+        <w:t>” del menú de estilos</w:t>
+      </w:r>
+    </w:p>
+    <w:p/>
+    <w:p>
+      <w:pPr>
+        <w:pStyle w:val="Ttulo2"/>
+      </w:pPr>
+      <w:bookmarkStart w:id="43" w:name="_Toc228992861"/>
       <w:r>
         <w:rPr>
           <w:caps w:val="0"/>
         </w:rPr>
-        <w:t xml:space="preserve"> Independientes</w:t>
-      </w:r>
-      <w:bookmarkEnd w:id="35"/>
+        <w:t>Análisis de Metadatos y Variables Clínicas</w:t>
+      </w:r>
+      <w:bookmarkEnd w:id="43"/>
     </w:p>
     <w:p>
       <w:pPr>
         <w:pStyle w:val="Ttulo3"/>
       </w:pPr>
-      <w:bookmarkStart w:id="36" w:name="_Toc226279085"/>
+      <w:bookmarkStart w:id="44" w:name="_Toc228992862"/>
       <w:r>
         <w:t>“Título 3” del menú de estilos</w:t>
       </w:r>
-      <w:bookmarkEnd w:id="36"/>
-    </w:p>
-    <w:p/>
-    <w:p>
-      <w:pPr>
-        <w:pStyle w:val="Ttulo2"/>
-      </w:pPr>
-      <w:bookmarkStart w:id="37" w:name="_Toc226279086"/>
-      <w:r>
-        <w:rPr>
-          <w:caps w:val="0"/>
-        </w:rPr>
-        <w:t>Análisis de Enriquecimiento Funcional</w:t>
-      </w:r>
-      <w:bookmarkEnd w:id="37"/>
-    </w:p>
-    <w:p>
-      <w:pPr>
-        <w:pStyle w:val="Ttulo3"/>
-      </w:pPr>
-      <w:bookmarkStart w:id="38" w:name="_Toc226279087"/>
-      <w:r>
-        <w:t>“Título 3” del menú de estilos</w:t>
-      </w:r>
-      <w:bookmarkEnd w:id="38"/>
-    </w:p>
-    <w:p>
-      <w:pPr>
-        <w:pStyle w:val="Ttulo4"/>
-      </w:pPr>
-      <w:r>
-        <w:t xml:space="preserve">“Título </w:t>
-      </w:r>
-      <w:r>
-        <w:t>4</w:t>
-      </w:r>
-      <w:r>
-        <w:t>” del menú de estilos</w:t>
-      </w:r>
-    </w:p>
-    <w:p/>
-    <w:p>
-      <w:pPr>
-        <w:pStyle w:val="Ttulo2"/>
-      </w:pPr>
-      <w:bookmarkStart w:id="39" w:name="_Toc226279088"/>
-      <w:r>
-        <w:rPr>
-          <w:caps w:val="0"/>
-        </w:rPr>
-        <w:t>Análisis de Metadatos y Variables Clínicas</w:t>
-      </w:r>
-      <w:bookmarkEnd w:id="39"/>
-    </w:p>
-    <w:p>
-      <w:pPr>
-        <w:pStyle w:val="Ttulo3"/>
-      </w:pPr>
-      <w:bookmarkStart w:id="40" w:name="_Toc226279089"/>
-      <w:r>
-        <w:t>“Título 3” del menú de estilos</w:t>
-      </w:r>
-      <w:bookmarkEnd w:id="40"/>
+      <w:bookmarkEnd w:id="44"/>
     </w:p>
     <w:p>
       <w:pPr>
@@ -6126,7 +7108,7 @@
       <w:pPr>
         <w:pStyle w:val="Ttulo1"/>
       </w:pPr>
-      <w:bookmarkStart w:id="41" w:name="_Toc226279090"/>
+      <w:bookmarkStart w:id="45" w:name="_Toc228992863"/>
       <w:r>
         <w:rPr>
           <w:caps w:val="0"/>
@@ -6134,30 +7116,30 @@
         <w:lastRenderedPageBreak/>
         <w:t>Discusión</w:t>
       </w:r>
-      <w:bookmarkEnd w:id="41"/>
+      <w:bookmarkEnd w:id="45"/>
     </w:p>
     <w:p>
       <w:pPr>
         <w:pStyle w:val="Ttulo2"/>
       </w:pPr>
-      <w:bookmarkStart w:id="42" w:name="_Toc226279091"/>
+      <w:bookmarkStart w:id="46" w:name="_Toc228992864"/>
       <w:r>
         <w:rPr>
           <w:caps w:val="0"/>
         </w:rPr>
         <w:t>Interpretación de los biomarcadores identificados</w:t>
       </w:r>
-      <w:bookmarkEnd w:id="42"/>
+      <w:bookmarkEnd w:id="46"/>
     </w:p>
     <w:p>
       <w:pPr>
         <w:pStyle w:val="Ttulo3"/>
       </w:pPr>
-      <w:bookmarkStart w:id="43" w:name="_Toc226279092"/>
+      <w:bookmarkStart w:id="47" w:name="_Toc228992865"/>
       <w:r>
         <w:t>“Título 3” del menú de estilos</w:t>
       </w:r>
-      <w:bookmarkEnd w:id="43"/>
+      <w:bookmarkEnd w:id="47"/>
     </w:p>
     <w:p>
       <w:pPr>
@@ -6172,62 +7154,48 @@
       <w:pPr>
         <w:pStyle w:val="Ttulo2"/>
       </w:pPr>
-      <w:bookmarkStart w:id="44" w:name="_Toc226279093"/>
+      <w:bookmarkStart w:id="48" w:name="_Toc228992866"/>
       <w:r>
         <w:rPr>
           <w:caps w:val="0"/>
         </w:rPr>
         <w:t>Análisis del enriquecimiento funcional en el contexto clínico</w:t>
       </w:r>
-      <w:bookmarkEnd w:id="44"/>
+      <w:bookmarkEnd w:id="48"/>
     </w:p>
     <w:p>
       <w:pPr>
         <w:pStyle w:val="Ttulo3"/>
       </w:pPr>
-      <w:bookmarkStart w:id="45" w:name="_Toc226279094"/>
+      <w:bookmarkStart w:id="49" w:name="_Toc228992867"/>
       <w:r>
         <w:t>“Título 3” del menú de estilos</w:t>
       </w:r>
-      <w:bookmarkEnd w:id="45"/>
+      <w:bookmarkEnd w:id="49"/>
     </w:p>
     <w:p/>
     <w:p>
       <w:pPr>
         <w:pStyle w:val="Ttulo2"/>
       </w:pPr>
-      <w:bookmarkStart w:id="46" w:name="_Toc226279095"/>
+      <w:bookmarkStart w:id="50" w:name="_Toc228992868"/>
       <w:r>
         <w:rPr>
           <w:caps w:val="0"/>
         </w:rPr>
-        <w:t xml:space="preserve">Comparación con estudios previos y </w:t>
-      </w:r>
-      <w:proofErr w:type="gramStart"/>
-      <w:r>
-        <w:rPr>
-          <w:caps w:val="0"/>
-        </w:rPr>
-        <w:t>meta-análisis</w:t>
-      </w:r>
-      <w:proofErr w:type="gramEnd"/>
-      <w:r>
-        <w:rPr>
-          <w:caps w:val="0"/>
-        </w:rPr>
-        <w:t xml:space="preserve"> existentes</w:t>
-      </w:r>
-      <w:bookmarkEnd w:id="46"/>
+        <w:t>Comparación con estudios previos y meta-análisis existentes</w:t>
+      </w:r>
+      <w:bookmarkEnd w:id="50"/>
     </w:p>
     <w:p>
       <w:pPr>
         <w:pStyle w:val="Ttulo3"/>
       </w:pPr>
-      <w:bookmarkStart w:id="47" w:name="_Toc226279096"/>
+      <w:bookmarkStart w:id="51" w:name="_Toc228992869"/>
       <w:r>
         <w:t>“Título 3” del menú de estilos</w:t>
       </w:r>
-      <w:bookmarkEnd w:id="47"/>
+      <w:bookmarkEnd w:id="51"/>
     </w:p>
     <w:p>
       <w:pPr>
@@ -6256,7 +7224,7 @@
       <w:pPr>
         <w:pStyle w:val="Ttulo1"/>
       </w:pPr>
-      <w:bookmarkStart w:id="48" w:name="_Toc226279097"/>
+      <w:bookmarkStart w:id="52" w:name="_Toc228992870"/>
       <w:r>
         <w:rPr>
           <w:caps w:val="0"/>
@@ -6264,30 +7232,30 @@
         <w:lastRenderedPageBreak/>
         <w:t>Conclusiones</w:t>
       </w:r>
-      <w:bookmarkEnd w:id="48"/>
+      <w:bookmarkEnd w:id="52"/>
     </w:p>
     <w:p>
       <w:pPr>
         <w:pStyle w:val="Ttulo2"/>
       </w:pPr>
-      <w:bookmarkStart w:id="49" w:name="_Toc226279098"/>
+      <w:bookmarkStart w:id="53" w:name="_Toc228992871"/>
       <w:r>
         <w:rPr>
           <w:caps w:val="0"/>
         </w:rPr>
         <w:t>Conclusiones respecto a los objetivos planteados</w:t>
       </w:r>
-      <w:bookmarkEnd w:id="49"/>
+      <w:bookmarkEnd w:id="53"/>
     </w:p>
     <w:p>
       <w:pPr>
         <w:pStyle w:val="Ttulo3"/>
       </w:pPr>
-      <w:bookmarkStart w:id="50" w:name="_Toc226279099"/>
+      <w:bookmarkStart w:id="54" w:name="_Toc228992872"/>
       <w:r>
         <w:t>“Título 3” del menú de estilos</w:t>
       </w:r>
-      <w:bookmarkEnd w:id="50"/>
+      <w:bookmarkEnd w:id="54"/>
     </w:p>
     <w:p>
       <w:pPr>
@@ -6302,24 +7270,24 @@
       <w:pPr>
         <w:pStyle w:val="Ttulo2"/>
       </w:pPr>
-      <w:bookmarkStart w:id="51" w:name="_Toc226279100"/>
+      <w:bookmarkStart w:id="55" w:name="_Toc228992873"/>
       <w:r>
         <w:rPr>
           <w:caps w:val="0"/>
         </w:rPr>
         <w:t>Líneas de investigación futuras</w:t>
       </w:r>
-      <w:bookmarkEnd w:id="51"/>
+      <w:bookmarkEnd w:id="55"/>
     </w:p>
     <w:p>
       <w:pPr>
         <w:pStyle w:val="Ttulo3"/>
       </w:pPr>
-      <w:bookmarkStart w:id="52" w:name="_Toc226279101"/>
+      <w:bookmarkStart w:id="56" w:name="_Toc228992874"/>
       <w:r>
         <w:t>“Título 3” del menú de estilos</w:t>
       </w:r>
-      <w:bookmarkEnd w:id="52"/>
+      <w:bookmarkEnd w:id="56"/>
     </w:p>
     <w:p/>
     <w:p>
@@ -6335,12 +7303,12 @@
       <w:pPr>
         <w:pStyle w:val="Ttulo1sinnumerar"/>
       </w:pPr>
-      <w:bookmarkStart w:id="53" w:name="_Toc226279102"/>
+      <w:bookmarkStart w:id="57" w:name="_Toc228992875"/>
       <w:r>
         <w:lastRenderedPageBreak/>
         <w:t>Referencias bibliográficas</w:t>
       </w:r>
-      <w:bookmarkEnd w:id="53"/>
+      <w:bookmarkEnd w:id="57"/>
     </w:p>
     <w:p/>
     <w:p>
@@ -6390,12 +7358,12 @@
       <w:pPr>
         <w:pStyle w:val="Anexo"/>
       </w:pPr>
-      <w:bookmarkStart w:id="54" w:name="_Toc226279103"/>
+      <w:bookmarkStart w:id="58" w:name="_Toc228992876"/>
       <w:r>
         <w:lastRenderedPageBreak/>
         <w:t>Encuestas realizadas</w:t>
       </w:r>
-      <w:bookmarkEnd w:id="54"/>
+      <w:bookmarkEnd w:id="58"/>
     </w:p>
     <w:p>
       <w:pPr>
@@ -6505,15 +7473,7 @@
         <w:jc w:val="left"/>
       </w:pPr>
       <w:r>
-        <w:t>Tipo de secuenciación (Bulk RNA-</w:t>
-      </w:r>
-      <w:proofErr w:type="spellStart"/>
-      <w:r>
-        <w:t>seq</w:t>
-      </w:r>
-      <w:proofErr w:type="spellEnd"/>
-      <w:r>
-        <w:t>).</w:t>
+        <w:t>Tipo de secuenciación (Bulk RNA-seq).</w:t>
       </w:r>
     </w:p>
     <w:p>
@@ -6533,23 +7493,7 @@
           <w:b/>
           <w:bCs/>
         </w:rPr>
-        <w:t xml:space="preserve">conteos crudos (raw </w:t>
-      </w:r>
-      <w:proofErr w:type="spellStart"/>
-      <w:r>
-        <w:rPr>
-          <w:b/>
-          <w:bCs/>
-        </w:rPr>
-        <w:t>counts</w:t>
-      </w:r>
-      <w:proofErr w:type="spellEnd"/>
-      <w:r>
-        <w:rPr>
-          <w:b/>
-          <w:bCs/>
-        </w:rPr>
-        <w:t>)</w:t>
+        <w:t>conteos crudos (raw counts)</w:t>
       </w:r>
       <w:r>
         <w:t xml:space="preserve"> en formato de números enteros para garantizar la compatibilidad con el modelo estadístico.</w:t>
@@ -6595,23 +7539,7 @@
         <w:t>Descripción de la cohorte:</w:t>
       </w:r>
       <w:r>
-        <w:t xml:space="preserve"> Tabla resumen con los </w:t>
-      </w:r>
-      <w:proofErr w:type="spellStart"/>
-      <w:r>
-        <w:t>IDs</w:t>
-      </w:r>
-      <w:proofErr w:type="spellEnd"/>
-      <w:r>
-        <w:t xml:space="preserve"> de los </w:t>
-      </w:r>
-      <w:proofErr w:type="spellStart"/>
-      <w:r>
-        <w:t>datasets</w:t>
-      </w:r>
-      <w:proofErr w:type="spellEnd"/>
-      <w:r>
-        <w:t xml:space="preserve"> (ej. GSE164541, TCGA-COAD), número de muestras totales, número de pares y versión del genoma de referencia (hg19/hg38).</w:t>
+        <w:t xml:space="preserve"> Tabla resumen con los IDs de los datasets (ej. GSE164541, TCGA-COAD), número de muestras totales, número de pares y versión del genoma de referencia (hg19/hg38).</w:t>
       </w:r>
     </w:p>
     <w:p>
@@ -6711,44 +7639,11 @@
           <w:b/>
           <w:bCs/>
         </w:rPr>
-        <w:t xml:space="preserve">PCA (Principal </w:t>
-      </w:r>
-      <w:proofErr w:type="spellStart"/>
-      <w:r>
-        <w:rPr>
-          <w:b/>
-          <w:bCs/>
-        </w:rPr>
-        <w:t>Component</w:t>
-      </w:r>
-      <w:proofErr w:type="spellEnd"/>
-      <w:r>
-        <w:rPr>
-          <w:b/>
-          <w:bCs/>
-        </w:rPr>
-        <w:t xml:space="preserve"> </w:t>
-      </w:r>
-      <w:proofErr w:type="spellStart"/>
-      <w:r>
-        <w:rPr>
-          <w:b/>
-          <w:bCs/>
-        </w:rPr>
-        <w:t>Analysis</w:t>
-      </w:r>
-      <w:proofErr w:type="spellEnd"/>
-      <w:r>
-        <w:rPr>
-          <w:b/>
-          <w:bCs/>
-        </w:rPr>
-        <w:t>)</w:t>
+        <w:t>PCA (Principal Component Analysis)</w:t>
       </w:r>
       <w:r>
         <w:t xml:space="preserve"> y mapas de calor de distancia entre muestras para detectar </w:t>
       </w:r>
-      <w:proofErr w:type="spellStart"/>
       <w:r>
         <w:rPr>
           <w:i/>
@@ -6756,35 +7651,16 @@
         </w:rPr>
         <w:t>outliers</w:t>
       </w:r>
-      <w:proofErr w:type="spellEnd"/>
       <w:r>
         <w:t xml:space="preserve"> o posibles efectos de lote (</w:t>
       </w:r>
-      <w:proofErr w:type="spellStart"/>
       <w:r>
         <w:rPr>
           <w:i/>
           <w:iCs/>
         </w:rPr>
-        <w:t>batch</w:t>
-      </w:r>
-      <w:proofErr w:type="spellEnd"/>
-      <w:r>
-        <w:rPr>
-          <w:i/>
-          <w:iCs/>
-        </w:rPr>
-        <w:t xml:space="preserve"> </w:t>
-      </w:r>
-      <w:proofErr w:type="spellStart"/>
-      <w:r>
-        <w:rPr>
-          <w:i/>
-          <w:iCs/>
-        </w:rPr>
-        <w:t>effects</w:t>
-      </w:r>
-      <w:proofErr w:type="spellEnd"/>
+        <w:t>batch effects</w:t>
+      </w:r>
       <w:r>
         <w:t>).</w:t>
       </w:r>
@@ -6869,15 +7745,7 @@
         <w:t>Diseño Experimental:</w:t>
       </w:r>
       <w:r>
-        <w:t xml:space="preserve"> Explicación del diseño pareado (~ Patient + </w:t>
-      </w:r>
-      <w:proofErr w:type="spellStart"/>
-      <w:r>
-        <w:t>Condition</w:t>
-      </w:r>
-      <w:proofErr w:type="spellEnd"/>
-      <w:r>
-        <w:t>). Es vital mencionar que se incluyó al paciente como factor en la fórmula para controlar la variabilidad biológica.</w:t>
+        <w:t xml:space="preserve"> Explicación del diseño pareado (~ Patient + Condition). Es vital mencionar que se incluyó al paciente como factor en la fórmula para controlar la variabilidad biológica.</w:t>
       </w:r>
     </w:p>
     <w:p>
@@ -6897,15 +7765,7 @@
         <w:t>Normalización:</w:t>
       </w:r>
       <w:r>
-        <w:t xml:space="preserve"> Descripción del método de normalización interno de DESeq2 (Median </w:t>
-      </w:r>
-      <w:proofErr w:type="spellStart"/>
-      <w:r>
-        <w:t>of</w:t>
-      </w:r>
-      <w:proofErr w:type="spellEnd"/>
-      <w:r>
-        <w:t xml:space="preserve"> Ratios).</w:t>
+        <w:t xml:space="preserve"> Descripción del método de normalización interno de DESeq2 (Median of Ratios).</w:t>
       </w:r>
     </w:p>
     <w:p>
@@ -7023,7 +7883,6 @@
       <w:r>
         <w:t xml:space="preserve"> Uso de </w:t>
       </w:r>
-      <w:proofErr w:type="spellStart"/>
       <w:r>
         <w:rPr>
           <w:b/>
@@ -7031,33 +7890,8 @@
         </w:rPr>
         <w:t>AnnotationHub</w:t>
       </w:r>
-      <w:proofErr w:type="spellEnd"/>
-      <w:r>
-        <w:t xml:space="preserve"> y la base de datos </w:t>
-      </w:r>
-      <w:proofErr w:type="spellStart"/>
-      <w:r>
-        <w:t>org.Hs.eg.db</w:t>
-      </w:r>
-      <w:proofErr w:type="spellEnd"/>
-      <w:r>
-        <w:t xml:space="preserve"> para la conversión de identificadores (</w:t>
-      </w:r>
-      <w:proofErr w:type="spellStart"/>
-      <w:r>
-        <w:t>Ensembl</w:t>
-      </w:r>
-      <w:proofErr w:type="spellEnd"/>
-      <w:r>
-        <w:t xml:space="preserve"> </w:t>
-      </w:r>
-      <w:proofErr w:type="spellStart"/>
-      <w:r>
-        <w:t>IDs</w:t>
-      </w:r>
-      <w:proofErr w:type="spellEnd"/>
-      <w:r>
-        <w:t xml:space="preserve"> a Gene Symbols).</w:t>
+      <w:r>
+        <w:t xml:space="preserve"> y la base de datos org.Hs.eg.db para la conversión de identificadores (Ensembl IDs a Gene Symbols).</w:t>
       </w:r>
     </w:p>
     <w:p>
@@ -7137,23 +7971,7 @@
           <w:b/>
           <w:bCs/>
         </w:rPr>
-        <w:t xml:space="preserve">Gene </w:t>
-      </w:r>
-      <w:proofErr w:type="spellStart"/>
-      <w:r>
-        <w:rPr>
-          <w:b/>
-          <w:bCs/>
-        </w:rPr>
-        <w:t>Ontology</w:t>
-      </w:r>
-      <w:proofErr w:type="spellEnd"/>
-      <w:r>
-        <w:rPr>
-          <w:b/>
-          <w:bCs/>
-        </w:rPr>
-        <w:t xml:space="preserve"> (GO)</w:t>
+        <w:t>Gene Ontology (GO)</w:t>
       </w:r>
       <w:r>
         <w:t xml:space="preserve"> y vías de </w:t>
@@ -7252,7 +8070,6 @@
       <w:r>
         <w:t xml:space="preserve"> y </w:t>
       </w:r>
-      <w:proofErr w:type="spellStart"/>
       <w:r>
         <w:rPr>
           <w:b/>
@@ -7260,7 +8077,6 @@
         </w:rPr>
         <w:t>Bioconductor</w:t>
       </w:r>
-      <w:proofErr w:type="spellEnd"/>
       <w:r>
         <w:t xml:space="preserve"> utilizada.</w:t>
       </w:r>
@@ -7282,15 +8098,7 @@
         <w:t>Librerías principales:</w:t>
       </w:r>
       <w:r>
-        <w:t xml:space="preserve"> Listado de paquetes clave (DESeq2, </w:t>
-      </w:r>
-      <w:proofErr w:type="spellStart"/>
-      <w:r>
-        <w:t>AnnotationHub</w:t>
-      </w:r>
-      <w:proofErr w:type="spellEnd"/>
-      <w:r>
-        <w:t>, ggplot2 para las gráficas).</w:t>
+        <w:t xml:space="preserve"> Listado de paquetes clave (DESeq2, AnnotationHub, ggplot2 para las gráficas).</w:t>
       </w:r>
     </w:p>
     <w:p>
@@ -12536,6 +13344,142 @@
       <w:rFonts w:ascii="Times New Roman" w:hAnsi="Times New Roman"/>
     </w:rPr>
   </w:style>
+  <w:style w:type="table" w:styleId="Tablaconcuadrcula7concolores">
+    <w:name w:val="Grid Table 7 Colorful"/>
+    <w:basedOn w:val="Tablanormal"/>
+    <w:uiPriority w:val="52"/>
+    <w:rsid w:val="00970175"/>
+    <w:rPr>
+      <w:color w:val="000000" w:themeColor="text1"/>
+    </w:rPr>
+    <w:tblPr>
+      <w:tblStyleRowBandSize w:val="1"/>
+      <w:tblStyleColBandSize w:val="1"/>
+      <w:tblBorders>
+        <w:top w:val="single" w:sz="4" w:space="0" w:color="666666" w:themeColor="text1" w:themeTint="99"/>
+        <w:left w:val="single" w:sz="4" w:space="0" w:color="666666" w:themeColor="text1" w:themeTint="99"/>
+        <w:bottom w:val="single" w:sz="4" w:space="0" w:color="666666" w:themeColor="text1" w:themeTint="99"/>
+        <w:right w:val="single" w:sz="4" w:space="0" w:color="666666" w:themeColor="text1" w:themeTint="99"/>
+        <w:insideH w:val="single" w:sz="4" w:space="0" w:color="666666" w:themeColor="text1" w:themeTint="99"/>
+        <w:insideV w:val="single" w:sz="4" w:space="0" w:color="666666" w:themeColor="text1" w:themeTint="99"/>
+      </w:tblBorders>
+    </w:tblPr>
+    <w:tblStylePr w:type="firstRow">
+      <w:rPr>
+        <w:b/>
+        <w:bCs/>
+      </w:rPr>
+      <w:tblPr/>
+      <w:tcPr>
+        <w:tcBorders>
+          <w:top w:val="nil"/>
+          <w:left w:val="nil"/>
+          <w:right w:val="nil"/>
+          <w:insideH w:val="nil"/>
+          <w:insideV w:val="nil"/>
+        </w:tcBorders>
+        <w:shd w:val="clear" w:color="auto" w:fill="FFFFFF" w:themeFill="background1"/>
+      </w:tcPr>
+    </w:tblStylePr>
+    <w:tblStylePr w:type="lastRow">
+      <w:rPr>
+        <w:b/>
+        <w:bCs/>
+      </w:rPr>
+      <w:tblPr/>
+      <w:tcPr>
+        <w:tcBorders>
+          <w:left w:val="nil"/>
+          <w:bottom w:val="nil"/>
+          <w:right w:val="nil"/>
+          <w:insideH w:val="nil"/>
+          <w:insideV w:val="nil"/>
+        </w:tcBorders>
+        <w:shd w:val="clear" w:color="auto" w:fill="FFFFFF" w:themeFill="background1"/>
+      </w:tcPr>
+    </w:tblStylePr>
+    <w:tblStylePr w:type="firstCol">
+      <w:pPr>
+        <w:jc w:val="right"/>
+      </w:pPr>
+      <w:rPr>
+        <w:i/>
+        <w:iCs/>
+      </w:rPr>
+      <w:tblPr/>
+      <w:tcPr>
+        <w:tcBorders>
+          <w:top w:val="nil"/>
+          <w:left w:val="nil"/>
+          <w:bottom w:val="nil"/>
+          <w:insideH w:val="nil"/>
+          <w:insideV w:val="nil"/>
+        </w:tcBorders>
+        <w:shd w:val="clear" w:color="auto" w:fill="FFFFFF" w:themeFill="background1"/>
+      </w:tcPr>
+    </w:tblStylePr>
+    <w:tblStylePr w:type="lastCol">
+      <w:rPr>
+        <w:i/>
+        <w:iCs/>
+      </w:rPr>
+      <w:tblPr/>
+      <w:tcPr>
+        <w:tcBorders>
+          <w:top w:val="nil"/>
+          <w:bottom w:val="nil"/>
+          <w:right w:val="nil"/>
+          <w:insideH w:val="nil"/>
+          <w:insideV w:val="nil"/>
+        </w:tcBorders>
+        <w:shd w:val="clear" w:color="auto" w:fill="FFFFFF" w:themeFill="background1"/>
+      </w:tcPr>
+    </w:tblStylePr>
+    <w:tblStylePr w:type="band1Vert">
+      <w:tblPr/>
+      <w:tcPr>
+        <w:shd w:val="clear" w:color="auto" w:fill="CCCCCC" w:themeFill="text1" w:themeFillTint="33"/>
+      </w:tcPr>
+    </w:tblStylePr>
+    <w:tblStylePr w:type="band1Horz">
+      <w:tblPr/>
+      <w:tcPr>
+        <w:shd w:val="clear" w:color="auto" w:fill="CCCCCC" w:themeFill="text1" w:themeFillTint="33"/>
+      </w:tcPr>
+    </w:tblStylePr>
+    <w:tblStylePr w:type="neCell">
+      <w:tblPr/>
+      <w:tcPr>
+        <w:tcBorders>
+          <w:bottom w:val="single" w:sz="4" w:space="0" w:color="666666" w:themeColor="text1" w:themeTint="99"/>
+        </w:tcBorders>
+      </w:tcPr>
+    </w:tblStylePr>
+    <w:tblStylePr w:type="nwCell">
+      <w:tblPr/>
+      <w:tcPr>
+        <w:tcBorders>
+          <w:bottom w:val="single" w:sz="4" w:space="0" w:color="666666" w:themeColor="text1" w:themeTint="99"/>
+        </w:tcBorders>
+      </w:tcPr>
+    </w:tblStylePr>
+    <w:tblStylePr w:type="seCell">
+      <w:tblPr/>
+      <w:tcPr>
+        <w:tcBorders>
+          <w:top w:val="single" w:sz="4" w:space="0" w:color="666666" w:themeColor="text1" w:themeTint="99"/>
+        </w:tcBorders>
+      </w:tcPr>
+    </w:tblStylePr>
+    <w:tblStylePr w:type="swCell">
+      <w:tblPr/>
+      <w:tcPr>
+        <w:tcBorders>
+          <w:top w:val="single" w:sz="4" w:space="0" w:color="666666" w:themeColor="text1" w:themeTint="99"/>
+        </w:tcBorders>
+      </w:tcPr>
+    </w:tblStylePr>
+  </w:style>
 </w:styles>
 </file>
 
@@ -12801,16 +13745,16 @@
 </file>
 
 <file path=customXml/item1.xml><?xml version="1.0" encoding="utf-8"?>
+<b:Sources xmlns:b="http://schemas.openxmlformats.org/officeDocument/2006/bibliography" xmlns="http://schemas.openxmlformats.org/officeDocument/2006/bibliography" SelectedStyle="\APASixthEditionOfficeOnline.xsl" StyleName="APA" Version="6"/>
+</file>
+
+<file path=customXml/item2.xml><?xml version="1.0" encoding="utf-8"?>
 <?mso-contentType ?>
 <FormTemplates xmlns="http://schemas.microsoft.com/sharepoint/v3/contenttype/forms">
   <Display>DocumentLibraryForm</Display>
   <Edit>DocumentLibraryForm</Edit>
   <New>DocumentLibraryForm</New>
 </FormTemplates>
-</file>
-
-<file path=customXml/item2.xml><?xml version="1.0" encoding="utf-8"?>
-<b:Sources xmlns:b="http://schemas.openxmlformats.org/officeDocument/2006/bibliography" xmlns="http://schemas.openxmlformats.org/officeDocument/2006/bibliography" SelectedStyle="\APASixthEditionOfficeOnline.xsl" StyleName="APA" Version="6"/>
 </file>
 
 <file path=customXml/item3.xml><?xml version="1.0" encoding="utf-8"?>
@@ -13075,17 +14019,17 @@
 </file>
 
 <file path=customXml/itemProps1.xml><?xml version="1.0" encoding="utf-8"?>
-<ds:datastoreItem xmlns:ds="http://schemas.openxmlformats.org/officeDocument/2006/customXml" ds:itemID="{57DC6A7E-A6FE-4629-9326-EE8561E00944}">
+<ds:datastoreItem xmlns:ds="http://schemas.openxmlformats.org/officeDocument/2006/customXml" ds:itemID="{E35E88E2-9BCD-476E-93C8-34C638B1B6E4}">
   <ds:schemaRefs>
-    <ds:schemaRef ds:uri="http://schemas.microsoft.com/sharepoint/v3/contenttype/forms"/>
+    <ds:schemaRef ds:uri="http://schemas.openxmlformats.org/officeDocument/2006/bibliography"/>
   </ds:schemaRefs>
 </ds:datastoreItem>
 </file>
 
 <file path=customXml/itemProps2.xml><?xml version="1.0" encoding="utf-8"?>
-<ds:datastoreItem xmlns:ds="http://schemas.openxmlformats.org/officeDocument/2006/customXml" ds:itemID="{E35E88E2-9BCD-476E-93C8-34C638B1B6E4}">
+<ds:datastoreItem xmlns:ds="http://schemas.openxmlformats.org/officeDocument/2006/customXml" ds:itemID="{57DC6A7E-A6FE-4629-9326-EE8561E00944}">
   <ds:schemaRefs>
-    <ds:schemaRef ds:uri="http://schemas.openxmlformats.org/officeDocument/2006/bibliography"/>
+    <ds:schemaRef ds:uri="http://schemas.microsoft.com/sharepoint/v3/contenttype/forms"/>
   </ds:schemaRefs>
 </ds:datastoreItem>
 </file>

</xml_diff>